<commit_message>
feat: tokenize all placeholders in D038 Garantia GFC template
Adds: contrato_numero, contrato_fecha, garante_nombre, garante_direccion,
garantia_monto, dia, dia_letras, mes, anio, anio_letras

Co-Authored-By: Claude Opus 4.6 <noreply@anthropic.com>
</commit_message>
<xml_diff>
--- a/resources/form_templates/estandar/SNCC_D038_Garantia_GFC.docx
+++ b/resources/form_templates/estandar/SNCC_D038_Garantia_GFC.docx
@@ -584,21 +584,12 @@
       </w:pPr>
       <w:r>
         <w:rPr>
-          <w:rStyle w:val="Style35"/>
-        </w:rPr>
-        <w:t>(</w:t>
-      </w:r>
-      <w:r>
-        <w:rPr>
-          <w:rStyle w:val="Style35"/>
-        </w:rPr>
-        <w:t>Indicar Nombre de la Entida</w:t>
-      </w:r>
-      <w:r>
-        <w:rPr>
-          <w:rStyle w:val="Style35"/>
-        </w:rPr>
-        <w:t>d)</w:t>
+          <w:rFonts w:eastAsia="Calibri"/>
+          <w:color w:val="FF0000"/>
+          <w:sz w:val="22"/>
+          <w:szCs w:val="22"/>
+        </w:rPr>
+        <w:t xml:space="preserve">${proceso_entidad}</w:t>
       </w:r>
     </w:p>
     <w:p>
@@ -624,11 +615,77 @@
       <w:r>
         <w:rPr>
           <w:rFonts w:ascii="Arial" w:hAnsi="Arial" w:cs="Arial"/>
+          <w:sz w:val="22"/>
+          <w:szCs w:val="22"/>
+        </w:rPr>
+        <w:t xml:space="preserve">POR CUANTO ${empresa_nombre}, ${empresa_direccion} (en lo sucesivo denominado “el Proveedor”) se ha obligado, en virtud del Contrato Nº ${contrato_numero} de fecha ${contrato_fecha} a suministrar a ${proceso_entidad} (en lo sucesivo denominado “el Comprador”). </w:t>
+      </w:r>
+    </w:p>
+    <w:p>
+      <w:pPr>
+        <w:spacing w:line="240" w:lineRule="auto"/>
+        <w:jc w:val="both"/>
+        <w:rPr>
           <w:b/>
           <w:sz w:val="22"/>
           <w:szCs w:val="22"/>
         </w:rPr>
+      </w:pPr>
+    </w:p>
+    <w:p>
+      <w:pPr>
+        <w:spacing w:line="240" w:lineRule="auto"/>
+        <w:jc w:val="both"/>
+        <w:rPr>
+          <w:rFonts w:eastAsia="Calibri"/>
+          <w:sz w:val="22"/>
+          <w:szCs w:val="22"/>
+        </w:rPr>
+      </w:pPr>
+      <w:r>
+        <w:rPr>
+          <w:rFonts w:eastAsia="Calibri"/>
+          <w:b/>
+          <w:sz w:val="22"/>
+          <w:szCs w:val="22"/>
+        </w:rPr>
         <w:t>POR CUANTO</w:t>
+      </w:r>
+      <w:r>
+        <w:rPr>
+          <w:rFonts w:eastAsia="Calibri"/>
+          <w:sz w:val="22"/>
+          <w:szCs w:val="22"/>
+        </w:rPr>
+        <w:t xml:space="preserve"> se ha convenido en dicho Contrato que el Proveedor le suministrará una garantía bancaria,  emitida a su favor por un garante de prestigio,  por la suma establecida  en el mismo, con el objeto de garantizar el fiel cumplimiento por parte del Proveedor de todas las obligaciones que le competen en virtud del mencionado Contrato.</w:t>
+      </w:r>
+    </w:p>
+    <w:p>
+      <w:pPr>
+        <w:spacing w:after="0" w:line="240" w:lineRule="auto"/>
+        <w:jc w:val="both"/>
+        <w:rPr>
+          <w:rFonts w:eastAsia="Calibri"/>
+          <w:sz w:val="22"/>
+          <w:szCs w:val="22"/>
+        </w:rPr>
+      </w:pPr>
+      <w:r>
+        <w:rPr>
+          <w:rFonts w:eastAsia="Calibri"/>
+          <w:b/>
+          <w:sz w:val="22"/>
+          <w:szCs w:val="22"/>
+        </w:rPr>
+        <w:t>POR CUANTO</w:t>
+      </w:r>
+      <w:r>
+        <w:rPr>
+          <w:rFonts w:eastAsia="Calibri"/>
+          <w:sz w:val="22"/>
+          <w:szCs w:val="22"/>
+        </w:rPr>
+        <w:t xml:space="preserve"> los suscritos</w:t>
       </w:r>
       <w:r>
         <w:rPr>
@@ -641,165 +698,7 @@
           <w:rStyle w:val="Style36"/>
           <w:color w:val="FF0000"/>
         </w:rPr>
-        <w:t>(nombre y dirección del contratista)</w:t>
-      </w:r>
-      <w:r>
-        <w:rPr>
-          <w:rFonts w:ascii="Arial" w:hAnsi="Arial" w:cs="Arial"/>
-          <w:sz w:val="22"/>
-          <w:szCs w:val="22"/>
-        </w:rPr>
-        <w:t xml:space="preserve"> (en lo sucesivo denominado “el Proveedor”) se ha obligado, en virtud del Contrato Nº</w:t>
-      </w:r>
-      <w:r>
-        <w:rPr>
-          <w:rStyle w:val="Style36"/>
-        </w:rPr>
-        <w:t xml:space="preserve"> </w:t>
-      </w:r>
-      <w:r>
-        <w:rPr>
-          <w:rStyle w:val="Style36"/>
-          <w:color w:val="FF0000"/>
-        </w:rPr>
-        <w:t>(Indicar Número</w:t>
-      </w:r>
-      <w:r>
-        <w:rPr>
-          <w:rStyle w:val="Style36"/>
-          <w:color w:val="FF0000"/>
-        </w:rPr>
-        <w:t>)</w:t>
-      </w:r>
-      <w:r>
-        <w:rPr>
-          <w:rFonts w:ascii="Arial" w:hAnsi="Arial" w:cs="Arial"/>
-          <w:sz w:val="22"/>
-          <w:szCs w:val="22"/>
-        </w:rPr>
-        <w:t xml:space="preserve"> de fecha</w:t>
-      </w:r>
-      <w:r>
-        <w:rPr>
-          <w:rStyle w:val="Style36"/>
-        </w:rPr>
-        <w:t xml:space="preserve"> </w:t>
-      </w:r>
-      <w:r>
-        <w:rPr>
-          <w:rStyle w:val="Style36"/>
-          <w:color w:val="FF0000"/>
-        </w:rPr>
-        <w:t>(indicar fecha de suscripción del contrato)</w:t>
-      </w:r>
-      <w:r>
-        <w:rPr>
-          <w:rFonts w:ascii="Arial" w:hAnsi="Arial" w:cs="Arial"/>
-          <w:sz w:val="22"/>
-          <w:szCs w:val="22"/>
-        </w:rPr>
-        <w:t xml:space="preserve"> a suministrar a</w:t>
-      </w:r>
-      <w:r>
-        <w:rPr>
-          <w:rStyle w:val="Style36"/>
-        </w:rPr>
-        <w:t xml:space="preserve"> </w:t>
-      </w:r>
-      <w:r>
-        <w:rPr>
-          <w:rStyle w:val="Style36"/>
-          <w:color w:val="FF0000"/>
-        </w:rPr>
-        <w:t>${proceso_entidad}</w:t>
-      </w:r>
-      <w:r>
-        <w:rPr>
-          <w:rFonts w:ascii="Arial" w:hAnsi="Arial" w:cs="Arial"/>
-          <w:sz w:val="22"/>
-          <w:szCs w:val="22"/>
-        </w:rPr>
-        <w:t xml:space="preserve"> (en lo sucesivo denominado “el Comprador”). </w:t>
-      </w:r>
-    </w:p>
-    <w:p>
-      <w:pPr>
-        <w:spacing w:line="240" w:lineRule="auto"/>
-        <w:jc w:val="both"/>
-        <w:rPr>
-          <w:b/>
-          <w:sz w:val="22"/>
-          <w:szCs w:val="22"/>
-        </w:rPr>
-      </w:pPr>
-    </w:p>
-    <w:p>
-      <w:pPr>
-        <w:spacing w:line="240" w:lineRule="auto"/>
-        <w:jc w:val="both"/>
-        <w:rPr>
-          <w:rFonts w:eastAsia="Calibri"/>
-          <w:sz w:val="22"/>
-          <w:szCs w:val="22"/>
-        </w:rPr>
-      </w:pPr>
-      <w:r>
-        <w:rPr>
-          <w:rFonts w:eastAsia="Calibri"/>
-          <w:b/>
-          <w:sz w:val="22"/>
-          <w:szCs w:val="22"/>
-        </w:rPr>
-        <w:t>POR CUANTO</w:t>
-      </w:r>
-      <w:r>
-        <w:rPr>
-          <w:rFonts w:eastAsia="Calibri"/>
-          <w:sz w:val="22"/>
-          <w:szCs w:val="22"/>
-        </w:rPr>
-        <w:t xml:space="preserve"> se ha convenido en dicho Contrato que el Proveedor le suministrará una garantía bancaria,  emitida a su favor por un garante de prestigio,  por la suma establecida  en el mismo, con el objeto de garantizar el fiel cumplimiento por parte del Proveedor de todas las obligaciones que le competen en virtud del mencionado Contrato.</w:t>
-      </w:r>
-    </w:p>
-    <w:p>
-      <w:pPr>
-        <w:spacing w:after="0" w:line="240" w:lineRule="auto"/>
-        <w:jc w:val="both"/>
-        <w:rPr>
-          <w:rFonts w:eastAsia="Calibri"/>
-          <w:sz w:val="22"/>
-          <w:szCs w:val="22"/>
-        </w:rPr>
-      </w:pPr>
-      <w:r>
-        <w:rPr>
-          <w:rFonts w:eastAsia="Calibri"/>
-          <w:b/>
-          <w:sz w:val="22"/>
-          <w:szCs w:val="22"/>
-        </w:rPr>
-        <w:t>POR CUANTO</w:t>
-      </w:r>
-      <w:r>
-        <w:rPr>
-          <w:rFonts w:eastAsia="Calibri"/>
-          <w:sz w:val="22"/>
-          <w:szCs w:val="22"/>
-        </w:rPr>
-        <w:t xml:space="preserve"> los suscritos</w:t>
-      </w:r>
-      <w:r>
-        <w:rPr>
-          <w:rStyle w:val="Style36"/>
-        </w:rPr>
-        <w:t xml:space="preserve"> </w:t>
-      </w:r>
-      <w:r>
-        <w:rPr>
-          <w:rStyle w:val="Style36"/>
-          <w:color w:val="FF0000"/>
-        </w:rPr>
-        <w:t>(nombre y dirección de la Entidad emisora)</w:t>
+        <w:t>${garante_nombre}, ${garante_direccion}</w:t>
       </w:r>
       <w:r>
         <w:rPr>
@@ -852,127 +751,10 @@
       <w:r>
         <w:rPr>
           <w:rFonts w:eastAsia="Calibri"/>
-          <w:b/>
-          <w:sz w:val="22"/>
-          <w:szCs w:val="22"/>
-        </w:rPr>
-        <w:t>DECLARAMOS</w:t>
-      </w:r>
-      <w:r>
-        <w:rPr>
-          <w:rFonts w:eastAsia="Calibri"/>
-          <w:sz w:val="22"/>
-          <w:szCs w:val="22"/>
-        </w:rPr>
-        <w:t xml:space="preserve"> mediante la presente nuestra calidad de Garantes a nombre del </w:t>
-      </w:r>
-      <w:r>
-        <w:rPr>
-          <w:rFonts w:eastAsia="Calibri"/>
-          <w:b/>
-          <w:sz w:val="22"/>
-          <w:szCs w:val="22"/>
-        </w:rPr>
-        <w:t>Proveedor</w:t>
-      </w:r>
-      <w:r>
-        <w:rPr>
-          <w:rFonts w:eastAsia="Calibri"/>
-          <w:sz w:val="22"/>
-          <w:szCs w:val="22"/>
-        </w:rPr>
-        <w:t xml:space="preserve"> y a favor del </w:t>
-      </w:r>
-      <w:r>
-        <w:rPr>
-          <w:rFonts w:eastAsia="Calibri"/>
-          <w:b/>
-          <w:sz w:val="22"/>
-          <w:szCs w:val="22"/>
-        </w:rPr>
-        <w:t>Comprador,</w:t>
-      </w:r>
-      <w:r>
-        <w:rPr>
-          <w:rFonts w:eastAsia="Calibri"/>
-          <w:sz w:val="22"/>
-          <w:szCs w:val="22"/>
-        </w:rPr>
-        <w:t xml:space="preserve"> por un monto máximo de</w:t>
-      </w:r>
-      <w:r>
-        <w:rPr>
-          <w:rFonts w:eastAsia="Calibri"/>
-          <w:sz w:val="22"/>
-          <w:szCs w:val="22"/>
-        </w:rPr>
-        <w:t xml:space="preserve"> </w:t>
-      </w:r>
-      <w:r>
-        <w:rPr>
-          <w:rStyle w:val="Style36"/>
-          <w:color w:val="FF0000"/>
-        </w:rPr>
-        <w:t xml:space="preserve">(indicar </w:t>
-      </w:r>
-      <w:r>
-        <w:rPr>
-          <w:rStyle w:val="Style36"/>
-          <w:color w:val="FF0000"/>
-        </w:rPr>
-        <w:t>la suma establecida en el Contrato</w:t>
-      </w:r>
-      <w:r>
-        <w:rPr>
-          <w:rStyle w:val="Style36"/>
-          <w:color w:val="FF0000"/>
-        </w:rPr>
-        <w:t>)</w:t>
-      </w:r>
-      <w:r>
-        <w:rPr>
-          <w:rFonts w:eastAsia="Calibri"/>
-          <w:sz w:val="22"/>
-          <w:szCs w:val="22"/>
-        </w:rPr>
-        <w:t xml:space="preserve"> y nos obligamos a pagar al Comprador, contra su primera solicitud escrita, en que se afirme que el Proveedor no ha cumplido con alguna obligación establecida en el Contrato, sin argumentaciones ni objeciones, cualquier suma o sumas dentro de los límites de</w:t>
-      </w:r>
-      <w:r>
-        <w:rPr>
-          <w:rFonts w:eastAsia="Calibri"/>
-          <w:sz w:val="22"/>
-          <w:szCs w:val="22"/>
-        </w:rPr>
-        <w:t xml:space="preserve"> </w:t>
-      </w:r>
-      <w:r>
-        <w:rPr>
-          <w:rStyle w:val="Style36"/>
-          <w:color w:val="FF0000"/>
-        </w:rPr>
-        <w:t xml:space="preserve">(indicar </w:t>
-      </w:r>
-      <w:r>
-        <w:rPr>
-          <w:rStyle w:val="Style36"/>
-          <w:color w:val="FF0000"/>
-        </w:rPr>
-        <w:t>la suma establecida en el Contrato</w:t>
-      </w:r>
-      <w:r>
-        <w:rPr>
-          <w:rStyle w:val="Style36"/>
-          <w:color w:val="FF0000"/>
-        </w:rPr>
-        <w:t>)</w:t>
-      </w:r>
-      <w:r>
-        <w:rPr>
-          <w:rFonts w:eastAsia="Calibri"/>
-          <w:sz w:val="22"/>
-          <w:szCs w:val="22"/>
-        </w:rPr>
-        <w:t xml:space="preserve">, sin necesidad de que el Comprador pruebe o acredite la causa o razones que sustentan la reclamación de la suma o sumas indicadas. </w:t>
+          <w:sz w:val="22"/>
+          <w:szCs w:val="22"/>
+        </w:rPr>
+        <w:t xml:space="preserve">DECLARAMOS mediante la presente nuestra calidad de Garantes a nombre del Proveedor y a favor del Comprador, por un monto máximo de ${garantia_monto} y nos obligamos a pagar al Comprador, contra su primera solicitud escrita, en que se afirme que el Proveedor no ha cumplido con alguna obligación establecida en el Contrato, sin argumentaciones ni objeciones, cualquier suma o sumas dentro de los límites de ${garantia_monto}, sin necesidad de que el Comprador pruebe o acredite la causa o razones que sustentan la reclamación de la suma o sumas indicadas. </w:t>
       </w:r>
     </w:p>
     <w:p>
@@ -1043,92 +825,11 @@
       <w:r>
         <w:rPr>
           <w:rFonts w:eastAsia="Calibri"/>
-          <w:sz w:val="22"/>
-          <w:szCs w:val="22"/>
-        </w:rPr>
-        <w:t>Esta garantía es válida hasta el día</w:t>
-      </w:r>
-      <w:r>
-        <w:rPr>
-          <w:rFonts w:eastAsia="Calibri"/>
-          <w:sz w:val="22"/>
-          <w:szCs w:val="22"/>
-        </w:rPr>
-        <w:t xml:space="preserve"> </w:t>
-      </w:r>
-      <w:r>
-        <w:rPr>
-          <w:rFonts w:eastAsia="Calibri"/>
           <w:color w:val="FF0000"/>
           <w:sz w:val="22"/>
           <w:szCs w:val="22"/>
         </w:rPr>
-        <w:t>(</w:t>
-      </w:r>
-      <w:r>
-        <w:rPr>
-          <w:rStyle w:val="Style36"/>
-          <w:color w:val="FF0000"/>
-        </w:rPr>
-        <w:t>indicar el día en letra y números)</w:t>
-      </w:r>
-      <w:r>
-        <w:rPr>
-          <w:rFonts w:eastAsia="Calibri"/>
-          <w:sz w:val="22"/>
-          <w:szCs w:val="22"/>
-        </w:rPr>
-        <w:t xml:space="preserve"> </w:t>
-      </w:r>
-      <w:r>
-        <w:rPr>
-          <w:rFonts w:eastAsia="Calibri"/>
-          <w:sz w:val="22"/>
-          <w:szCs w:val="22"/>
-        </w:rPr>
-        <w:t>del</w:t>
-      </w:r>
-      <w:r>
-        <w:rPr>
-          <w:rStyle w:val="Style36"/>
-        </w:rPr>
-        <w:t xml:space="preserve"> </w:t>
-      </w:r>
-      <w:r>
-        <w:rPr>
-          <w:rStyle w:val="Style36"/>
-          <w:color w:val="FF0000"/>
-        </w:rPr>
-        <w:t>(indicar el mes)</w:t>
-      </w:r>
-      <w:r>
-        <w:rPr>
-          <w:rFonts w:eastAsia="Calibri"/>
-          <w:sz w:val="22"/>
-          <w:szCs w:val="22"/>
-        </w:rPr>
-        <w:t xml:space="preserve"> del</w:t>
-      </w:r>
-      <w:r>
-        <w:rPr>
-          <w:rStyle w:val="Style36"/>
-        </w:rPr>
-        <w:t xml:space="preserve"> </w:t>
-      </w:r>
-      <w:r>
-        <w:rPr>
-          <w:rStyle w:val="Style36"/>
-          <w:color w:val="FF0000"/>
-        </w:rPr>
-        <w:t>(indicar año en letra y números)</w:t>
-      </w:r>
-      <w:r>
-        <w:rPr>
-          <w:rFonts w:eastAsia="Calibri"/>
-          <w:sz w:val="22"/>
-          <w:szCs w:val="22"/>
-        </w:rPr>
-        <w:t>.</w:t>
+        <w:t xml:space="preserve">Esta garantía es válida hasta el día ${dia} (${dia_letras}) del ${mes} del ${anio} (${anio_letras}).</w:t>
       </w:r>
     </w:p>
     <w:p>

</xml_diff>

<commit_message>
fix: restore D038 template from corruption, re-tokenize safely
The previous tokenization used replaceInRuns() which corrupted a VML
text box in the DOCX XML. Restored from last valid version (45dcad3)
and re-applied all tokenizations by modifying <w:t> content only.

Also pass raw $params to fallback template generator so D038-specific
tokens (contratista_nombre, contrato_numero, etc.) get populated.

Co-Authored-By: Claude Opus 4.6 <noreply@anthropic.com>
</commit_message>
<xml_diff>
--- a/resources/form_templates/estandar/SNCC_D038_Garantia_GFC.docx
+++ b/resources/form_templates/estandar/SNCC_D038_Garantia_GFC.docx
@@ -1,6 +1,1276 @@
 
-<file path=word/document.xml><?xml version="1.0" encoding="UTF-8" standalone="yes"?>
-<w:document xmlns:wpc="http://schemas.microsoft.com/office/word/2010/wordprocessingCanvas" xmlns:cx="http://schemas.microsoft.com/office/drawing/2014/chartex" xmlns:cx1="http://schemas.microsoft.com/office/drawing/2015/9/8/chartex" xmlns:mc="http://schemas.openxmlformats.org/markup-compatibility/2006" xmlns:o="urn:schemas-microsoft-com:office:office" xmlns:r="http://schemas.openxmlformats.org/officeDocument/2006/relationships" xmlns:m="http://schemas.openxmlformats.org/officeDocument/2006/math" xmlns:v="urn:schemas-microsoft-com:vml" xmlns:wp14="http://schemas.microsoft.com/office/word/2010/wordprocessingDrawing" xmlns:wp="http://schemas.openxmlformats.org/drawingml/2006/wordprocessingDrawing" xmlns:w10="urn:schemas-microsoft-com:office:word" xmlns:w="http://schemas.openxmlformats.org/wordprocessingml/2006/main" xmlns:w14="http://schemas.microsoft.com/office/word/2010/wordml" xmlns:w15="http://schemas.microsoft.com/office/word/2012/wordml" xmlns:w16se="http://schemas.microsoft.com/office/word/2015/wordml/symex" xmlns:wpg="http://schemas.microsoft.com/office/word/2010/wordprocessingGroup" xmlns:wpi="http://schemas.microsoft.com/office/word/2010/wordprocessingInk" xmlns:wne="http://schemas.microsoft.com/office/word/2006/wordml" xmlns:wps="http://schemas.microsoft.com/office/word/2010/wordprocessingShape" mc:Ignorable="w14 w15 w16se wp14"><w:body><w:p><w:r><w:rPr><w:noProof/><w:lang w:val="en-US"/></w:rPr><w:pict><v:group id="_x0000_s1045" style="position:absolute;margin-left:354.15pt;margin-top:-34.95pt;width:127.2pt;height:55.2pt;z-index:251697152" coordorigin="12866,523" coordsize="2544,1104"><v:rect id="_x0000_s1046" style="position:absolute;left:12866;top:523;width:2544;height:1104" filled="f"/><v:group id="_x0000_s1047" style="position:absolute;left:12940;top:561;width:2413;height:968" coordorigin="9151,720" coordsize="2009,900"><v:shapetype id="_x0000_t202" coordsize="21600,21600" o:spt="202" path="m,l,21600r21600,l21600,xe"><v:stroke joinstyle="miter"/><v:path gradientshapeok="t" o:connecttype="rect"/></v:shapetype><v:shape id="_x0000_s1048" type="#_x0000_t202" style="position:absolute;left:9151;top:1077;width:2009;height:543;mso-width-relative:margin;mso-height-relative:margin" fillcolor="white [3212]" strokecolor="white [3212]" strokeweight="2.25pt"><v:textbox style="mso-next-textbox:#_x0000_s1048" inset=",0"><w:txbxContent><w:sdt><w:sdtPr><w:rPr><w:rStyle w:val="Style2"/></w:rPr><w:alias w:val="No. del Expediente de Compras "/><w:tag w:val="No. del Expediente de Compras "/><w:id w:val="5755464"/><w:showingPlcHdr/></w:sdtPr><w:sdtEndPr><w:rPr><w:rStyle w:val="Style2"/></w:rPr></w:sdtEndPr><w:sdtContent><w:p><w:pPr><w:jc w:val="center"/></w:pPr><w:r><w:rPr><w:rStyle w:val="Textodelmarcadordeposicin"/></w:rPr><w:t>${proceso_codigo}</w:t></w:r></w:p></w:sdtContent></w:sdt></w:txbxContent></v:textbox></v:shape><v:shape id="_x0000_s1049" type="#_x0000_t202" style="position:absolute;left:9151;top:720;width:2009;height:360;mso-width-relative:margin;mso-height-relative:margin" fillcolor="black [3213]" strokecolor="white [3212]" strokeweight="3pt"><v:textbox style="mso-next-textbox:#_x0000_s1049"><w:txbxContent><w:p><w:pPr><w:jc w:val="center"/><w:rPr><w:rFonts w:ascii="Franklin Gothic Medium Cond" w:hAnsi="Franklin Gothic Medium Cond"/><w:b/><w:color w:val="FFFFFF" w:themeColor="background1"/><w:lang w:val="en-US"/></w:rPr></w:pPr><w:r><w:rPr><w:rFonts w:ascii="Franklin Gothic Medium Cond" w:hAnsi="Franklin Gothic Medium Cond"/><w:b/><w:color w:val="FFFFFF" w:themeColor="background1"/></w:rPr><w:t>No. Expediente: ${proceso_expediente}</w:t></w:r></w:p></w:txbxContent></v:textbox></v:shape></v:group></v:group></w:pict></w:r><w:r><w:rPr><w:noProof/><w:lang w:val="es-DO" w:eastAsia="es-DO"/></w:rPr><w:drawing><wp:anchor distT="0" distB="0" distL="114300" distR="114300" simplePos="0" relativeHeight="251698176" behindDoc="0" locked="0" layoutInCell="1" allowOverlap="1"><wp:simplePos x="0" y="0"/><wp:positionH relativeFrom="margin"><wp:posOffset>2583180</wp:posOffset></wp:positionH><wp:positionV relativeFrom="margin"><wp:posOffset>-516255</wp:posOffset></wp:positionV><wp:extent cx="882000" cy="878400"/><wp:effectExtent l="0" t="0" r="0" b="0"/><wp:wrapSquare wrapText="bothSides"/><wp:docPr id="3" name="Imagen 3" descr="C:\Users\emontesdeoca\Desktop\Escudo Nacional 2018.png"/><wp:cNvGraphicFramePr><a:graphicFrameLocks xmlns:a="http://schemas.openxmlformats.org/drawingml/2006/main" noChangeAspect="1"/></wp:cNvGraphicFramePr><a:graphic xmlns:a="http://schemas.openxmlformats.org/drawingml/2006/main"><a:graphicData uri="http://schemas.openxmlformats.org/drawingml/2006/picture"><pic:pic xmlns:pic="http://schemas.openxmlformats.org/drawingml/2006/picture"><pic:nvPicPr><pic:cNvPr id="0" name="Picture 1" descr="C:\Users\emontesdeoca\Desktop\Escudo Nacional 2018.png"/><pic:cNvPicPr><a:picLocks noChangeAspect="1" noChangeArrowheads="1"/></pic:cNvPicPr></pic:nvPicPr><pic:blipFill><a:blip r:embed="rId8" cstate="print"><a:extLst><a:ext uri="{28A0092B-C50C-407E-A947-70E740481C1C}"><a14:useLocalDpi xmlns:a14="http://schemas.microsoft.com/office/drawing/2010/main" val="0"/></a:ext></a:extLst></a:blip><a:srcRect/><a:stretch><a:fillRect/></a:stretch></pic:blipFill><pic:spPr bwMode="auto"><a:xfrm><a:off x="0" y="0"/><a:ext cx="882000" cy="878400"/></a:xfrm><a:prstGeom prst="rect"><a:avLst/></a:prstGeom><a:noFill/><a:ln><a:noFill/></a:ln></pic:spPr></pic:pic></a:graphicData></a:graphic><wp14:sizeRelH relativeFrom="margin"><wp14:pctWidth>0</wp14:pctWidth></wp14:sizeRelH><wp14:sizeRelV relativeFrom="margin"><wp14:pctHeight>0</wp14:pctHeight></wp14:sizeRelV></wp:anchor></w:drawing></w:r><w:r><w:rPr><w:noProof/><w:lang w:val="en-US" w:eastAsia="zh-TW"/></w:rPr><w:pict><v:shape id="_x0000_s1026" type="#_x0000_t202" style="position:absolute;margin-left:-35.7pt;margin-top:-13.1pt;width:81pt;height:84.9pt;z-index:251661312;mso-position-horizontal-relative:text;mso-position-vertical-relative:text;mso-width-relative:margin;mso-height-relative:margin" filled="f" stroked="f"><v:textbox style="mso-next-textbox:#_x0000_s1026"><w:txbxContent><w:sdt><w:sdtPr><w:rPr><w:lang w:val="en-US"/></w:rPr><w:alias w:val="Logo de la dependencia gubernamental"/><w:tag w:val="Logo de la dependencia gubernamental"/><w:id w:val="13417745"/><w:showingPlcHdr/><w:picture/></w:sdtPr><w:sdtEndPr/><w:sdtContent><w:p><w:pPr><w:rPr><w:lang w:val="en-US"/></w:rPr></w:pPr><w:r><w:rPr><w:noProof/><w:lang w:val="es-DO" w:eastAsia="es-DO"/></w:rPr><w:drawing><wp:inline distT="0" distB="0" distL="0" distR="0"><wp:extent cx="800100" cy="800100"/><wp:effectExtent l="19050" t="0" r="0" b="0"/><wp:docPr id="2" name="Picture 1"/><wp:cNvGraphicFramePr><a:graphicFrameLocks xmlns:a="http://schemas.openxmlformats.org/drawingml/2006/main" noChangeAspect="1"/></wp:cNvGraphicFramePr><a:graphic xmlns:a="http://schemas.openxmlformats.org/drawingml/2006/main"><a:graphicData uri="http://schemas.openxmlformats.org/drawingml/2006/picture"><pic:pic xmlns:pic="http://schemas.openxmlformats.org/drawingml/2006/picture"><pic:nvPicPr><pic:cNvPr id="0" name="Picture 1"/><pic:cNvPicPr><a:picLocks noChangeAspect="1" noChangeArrowheads="1"/></pic:cNvPicPr></pic:nvPicPr><pic:blipFill><a:blip r:embed="rId9"/><a:srcRect/><a:stretch><a:fillRect/></a:stretch></pic:blipFill><pic:spPr bwMode="auto"><a:xfrm><a:off x="0" y="0"/><a:ext cx="799693" cy="799693"/></a:xfrm><a:prstGeom prst="rect"><a:avLst/></a:prstGeom><a:noFill/><a:ln w="9525"><a:noFill/><a:miter lim="800000"/><a:headEnd/><a:tailEnd/></a:ln></pic:spPr></pic:pic></a:graphicData></a:graphic></wp:inline></w:drawing></w:r></w:p></w:sdtContent></w:sdt></w:txbxContent></v:textbox></v:shape></w:pict></w:r><w:r><w:rPr><w:noProof/><w:lang w:val="en-US"/></w:rPr><w:pict><v:shape id="_x0000_s1044" type="#_x0000_t202" style="position:absolute;margin-left:-27.65pt;margin-top:-39.55pt;width:74.65pt;height:24.05pt;z-index:251696128;mso-position-horizontal-relative:text;mso-position-vertical-relative:text;mso-width-relative:margin;mso-height-relative:margin" filled="f" stroked="f"><v:textbox style="mso-next-textbox:#_x0000_s1044" inset="0,0,0,0"><w:txbxContent><w:p><w:pPr><w:rPr><w:rFonts w:ascii="Arial Narrow" w:hAnsi="Arial Narrow"/><w:b/><w:caps/><w:color w:val="C00000"/><w:spacing w:val="-8"/><w:sz w:val="22"/><w:szCs w:val="12"/></w:rPr></w:pPr><w:r><w:rPr><w:rStyle w:val="Style15"/><w:rFonts w:cstheme="minorBidi"/><w:b/><w:color w:val="C00000"/><w:sz w:val="22"/></w:rPr><w:t>SNCC.D.038</w:t></w:r></w:p></w:txbxContent></v:textbox></v:shape></w:pict></w:r><w:r><w:t xml:space="preserve">                                       </w:t></w:r><w:bookmarkStart w:id="0" w:name="_GoBack"/><w:bookmarkEnd w:id="0"/></w:p><w:p><w:pPr><w:rPr><w:lang w:val="es-ES_tradnl"/></w:rPr></w:pPr><w:r><w:rPr><w:rStyle w:val="Institucion"/><w:color w:val="FF0000"/><w:sz w:val="28"/><w:lang w:eastAsia="zh-TW"/></w:rPr><w:t xml:space="preserve">&lt;w:p&gt;&lt;w:pPr&gt;&lt;w:rPr&gt;&lt;w:lang w:val="es-ES_tradnl"/&gt;&lt;/w:rPr&gt;&lt;/w:pPr&gt;&lt;w:sdt&gt;&lt;w:sdtPr&gt;&lt;w:rPr&gt;&lt;w:rStyle w:val="Style6"/&gt;&lt;w:sz w:val="24"/&gt;&lt;w:szCs w:val="24"/&gt;&lt;/w:rPr&gt;&lt;w:alias w:val="Nombre de la Institución"/&gt;&lt;w:tag w:val="Nombre de la Institución"/&gt;&lt;w:id w:val="8389551"/&gt;&lt;/w:sdtPr&gt;&lt;w:sdtEndPr&gt;&lt;w:rPr&gt;&lt;w:rStyle w:val="Style6"/&gt;&lt;/w:rPr&gt;&lt;/w:sdtEndPr&gt;&lt;w:sdtContent&gt;&lt;w:r&gt;&lt;w:rPr&gt;&lt;w:rStyle w:val="Style6"/&gt;&lt;w:sz w:val="24"/&gt;&lt;w:szCs w:val="24"/&gt;&lt;/w:rPr&gt;&lt;w:t&gt;${entidad_nombre}</w:t></w:r></w:p></w:txbxContent></v:textbox></v:shape></w:pict></w:r><w:r><w:rPr><w:noProof/><w:lang w:val="en-US" w:eastAsia="zh-TW"/></w:rPr><w:pict><v:shape id="_x0000_s1036" type="#_x0000_t202" style="position:absolute;margin-left:375.15pt;margin-top:2.5pt;width:112.45pt;height:21.9pt;z-index:251685888;mso-width-relative:margin;mso-height-relative:margin" filled="f" stroked="f"><v:textbox style="mso-next-textbox:#_x0000_s1036"><w:txbxContent><w:p><w:sdt><w:sdtPr><w:rPr><w:rStyle w:val="Style5"/></w:rPr><w:alias w:val="Fecha de emisión del documento"/><w:tag w:val="Fecha de emisión del documento"/><w:id w:val="13417894"/><w:date><w:dateFormat w:val="dd' de 'MMMM' de 'yyyy"/><w:lid w:val="es-DO"/><w:storeMappedDataAs w:val="dateTime"/><w:calendar w:val="gregorian"/></w:date></w:sdtPr><w:sdtEndPr><w:rPr><w:rStyle w:val="Style5"/></w:rPr></w:sdtEndPr><w:sdtContent><w:r><w:rPr><w:rStyle w:val="Style5"/></w:rPr><w:t xml:space="preserve">${fecha} </w:t></w:r></w:sdtContent></w:sdt></w:p></w:txbxContent></v:textbox></v:shape></w:pict></w:r></w:p><w:p><w:r><w:rPr><w:noProof/><w:color w:val="FF0000"/><w:lang w:eastAsia="zh-TW"/></w:rPr><w:pict><v:shape id="_x0000_s1042" type="#_x0000_t202" style="position:absolute;margin-left:96.85pt;margin-top:16.6pt;width:272.95pt;height:21.85pt;z-index:251695104;mso-width-relative:margin;mso-height-relative:margin" stroked="f"><v:textbox style="mso-next-textbox:#_x0000_s1042"><w:txbxContent><w:p><w:pPr><w:jc w:val="center"/><w:rPr><w:rFonts w:asciiTheme="minorHAnsi" w:hAnsiTheme="minorHAnsi"/><w:lang w:val="es-ES_tradnl"/></w:rPr></w:pPr><w:r><w:rPr><w:rStyle w:val="Style7"/><w:rFonts w:asciiTheme="minorHAnsi" w:hAnsiTheme="minorHAnsi"/><w:lang w:val="es-ES_tradnl"/></w:rPr><w:t xml:space="preserve">garantía </w:t></w:r><w:r><w:rPr><w:rStyle w:val="Style7"/><w:rFonts w:asciiTheme="minorHAnsi" w:hAnsiTheme="minorHAnsi"/><w:lang w:val="es-ES_tradnl"/></w:rPr><w:t>de fiel cumplimiento de contrato</w:t></w:r><w:r><w:rPr><w:rStyle w:val="Style7"/><w:rFonts w:asciiTheme="minorHAnsi" w:hAnsiTheme="minorHAnsi"/><w:lang w:val="es-ES_tradnl"/></w:rPr><w:t xml:space="preserve"> </w:t></w:r></w:p></w:txbxContent></v:textbox></v:shape></w:pict></w:r><w:r><w:rPr><w:noProof/><w:sz w:val="24"/><w:szCs w:val="24"/><w:lang w:eastAsia="es-ES"/></w:rPr><w:pict><v:shape id="_x0000_s1037" type="#_x0000_t202" style="position:absolute;margin-left:402.5pt;margin-top:7.3pt;width:89pt;height:19.85pt;z-index:251686912;mso-width-relative:margin;mso-height-relative:margin" filled="f" stroked="f"><v:textbox style="mso-next-textbox:#_x0000_s1037"><w:txbxContent><w:p><w:pPr><w:rPr><w:sz w:val="22"/><w:szCs w:val="22"/></w:rPr></w:pPr><w:r><w:rPr><w:sz w:val="22"/><w:szCs w:val="22"/></w:rPr><w:t xml:space="preserve">Página </w:t></w:r><w:r><w:rPr><w:b/><w:sz w:val="22"/><w:szCs w:val="22"/></w:rPr><w:fldChar w:fldCharType="begin"/></w:r><w:r><w:rPr><w:b/><w:sz w:val="22"/><w:szCs w:val="22"/></w:rPr><w:instrText xml:space="preserve"> PAGE   \* MERGEFORMAT </w:instrText></w:r><w:r><w:rPr><w:b/><w:sz w:val="22"/><w:szCs w:val="22"/></w:rPr><w:fldChar w:fldCharType="separate"/></w:r><w:r><w:rPr><w:b/><w:noProof/><w:sz w:val="22"/><w:szCs w:val="22"/></w:rPr><w:t>1</w:t></w:r><w:r><w:rPr><w:b/><w:sz w:val="22"/><w:szCs w:val="22"/></w:rPr><w:fldChar w:fldCharType="end"/></w:r><w:r><w:rPr><w:sz w:val="22"/><w:szCs w:val="22"/></w:rPr><w:t xml:space="preserve"> de </w:t></w:r><w:fldSimple w:instr=" NUMPAGES   \* MERGEFORMAT "><w:r><w:rPr><w:b/><w:noProof/><w:sz w:val="22"/><w:szCs w:val="22"/></w:rPr><w:t>1</w:t></w:r></w:fldSimple></w:p></w:txbxContent></v:textbox></v:shape></w:pict></w:r></w:p><w:p><w:pPr><w:tabs><w:tab w:val="left" w:pos="6267"/></w:tabs><w:spacing w:after="0" w:line="240" w:lineRule="auto"/><w:jc w:val="center"/></w:pPr></w:p><w:p><w:pPr><w:tabs><w:tab w:val="left" w:pos="6267"/></w:tabs><w:jc w:val="center"/><w:rPr><w:sz w:val="24"/><w:szCs w:val="24"/></w:rPr></w:pPr></w:p><w:p><w:pPr><w:spacing w:after="0" w:line="240" w:lineRule="auto"/><w:jc w:val="both"/><w:rPr><w:rFonts w:eastAsia="Calibri"/><w:sz w:val="22"/><w:szCs w:val="22"/></w:rPr></w:pPr><w:r><w:rPr><w:rFonts w:eastAsia="Calibri"/><w:sz w:val="22"/><w:szCs w:val="22"/></w:rPr><w:t>Señores</w:t></w:r></w:p><w:p><w:pPr><w:spacing w:after="0" w:line="240" w:lineRule="auto"/><w:jc w:val="both"/><w:rPr><w:rFonts w:eastAsia="Calibri"/><w:color w:val="FF0000"/><w:sz w:val="22"/><w:szCs w:val="22"/></w:rPr></w:pPr><w:r><w:rPr><w:rFonts w:eastAsia="Calibri"/><w:color w:val="FF0000"/><w:sz w:val="22"/><w:szCs w:val="22"/></w:rPr><w:t xml:space="preserve">${proceso_entidad}</w:t></w:r></w:p><w:p><w:pPr><w:spacing w:after="0"/><w:jc w:val="both"/><w:rPr><w:rFonts w:eastAsia="Calibri"/><w:sz w:val="22"/><w:szCs w:val="22"/></w:rPr></w:pPr></w:p><w:p><w:pPr><w:pStyle w:val="Textoindependiente2"/><w:rPr><w:rFonts w:ascii="Arial" w:hAnsi="Arial" w:cs="Arial"/><w:sz w:val="22"/><w:szCs w:val="22"/></w:rPr></w:pPr><w:r><w:rPr><w:rFonts w:ascii="Arial" w:hAnsi="Arial" w:cs="Arial"/><w:sz w:val="22"/><w:szCs w:val="22"/></w:rPr><w:t xml:space="preserve">POR CUANTO ${empresa_nombre}, ${empresa_direccion} (en lo sucesivo denominado “el Proveedor”) se ha obligado, en virtud del Contrato Nº ${contrato_numero} de fecha ${contrato_fecha} a suministrar a ${proceso_entidad} (en lo sucesivo denominado “el Comprador”). </w:t></w:r></w:p><w:p><w:pPr><w:spacing w:line="240" w:lineRule="auto"/><w:jc w:val="both"/><w:rPr><w:b/><w:sz w:val="22"/><w:szCs w:val="22"/></w:rPr></w:pPr></w:p><w:p><w:pPr><w:spacing w:line="240" w:lineRule="auto"/><w:jc w:val="both"/><w:rPr><w:rFonts w:eastAsia="Calibri"/><w:sz w:val="22"/><w:szCs w:val="22"/></w:rPr></w:pPr><w:r><w:rPr><w:rFonts w:eastAsia="Calibri"/><w:b/><w:sz w:val="22"/><w:szCs w:val="22"/></w:rPr><w:t>POR CUANTO</w:t></w:r><w:r><w:rPr><w:rFonts w:eastAsia="Calibri"/><w:sz w:val="22"/><w:szCs w:val="22"/></w:rPr><w:t xml:space="preserve"> se ha convenido en dicho Contrato que el Proveedor le suministrará una garantía bancaria,  emitida a su favor por un garante de prestigio,  por la suma establecida  en el mismo, con el objeto de garantizar el fiel cumplimiento por parte del Proveedor de todas las obligaciones que le competen en virtud del mencionado Contrato.</w:t></w:r></w:p><w:p><w:pPr><w:spacing w:after="0" w:line="240" w:lineRule="auto"/><w:jc w:val="both"/><w:rPr><w:rFonts w:eastAsia="Calibri"/><w:sz w:val="22"/><w:szCs w:val="22"/></w:rPr></w:pPr><w:r><w:rPr><w:rFonts w:eastAsia="Calibri"/><w:b/><w:sz w:val="22"/><w:szCs w:val="22"/></w:rPr><w:t>POR CUANTO</w:t></w:r><w:r><w:rPr><w:rFonts w:eastAsia="Calibri"/><w:sz w:val="22"/><w:szCs w:val="22"/></w:rPr><w:t xml:space="preserve"> los suscritos</w:t></w:r><w:r><w:rPr><w:rStyle w:val="Style36"/></w:rPr><w:t xml:space="preserve"> </w:t></w:r><w:r><w:rPr><w:rStyle w:val="Style36"/><w:color w:val="FF0000"/></w:rPr><w:t>${garante_nombre}, ${garante_direccion}</w:t></w:r><w:r><w:rPr><w:rFonts w:eastAsia="Calibri"/><w:sz w:val="22"/><w:szCs w:val="22"/></w:rPr><w:t xml:space="preserve"> (en lo sucesivo denominados “el Garante”</w:t></w:r><w:r><w:rPr><w:rFonts w:eastAsia="Calibri"/><w:i/><w:iCs/><w:sz w:val="22"/><w:szCs w:val="22"/></w:rPr><w:t>)</w:t></w:r><w:r><w:rPr><w:rFonts w:eastAsia="Calibri"/><w:sz w:val="22"/><w:szCs w:val="22"/></w:rPr><w:t xml:space="preserve">, hemos convenido en proporcionar al Proveedor una garantía en beneficio del Comprador. </w:t></w:r></w:p><w:p><w:pPr><w:spacing w:line="240" w:lineRule="auto"/><w:jc w:val="both"/><w:rPr><w:rFonts w:eastAsia="Calibri"/><w:sz w:val="22"/><w:szCs w:val="22"/></w:rPr></w:pPr></w:p><w:p><w:pPr><w:spacing w:after="0" w:line="240" w:lineRule="auto"/><w:jc w:val="both"/><w:rPr><w:rFonts w:eastAsia="Calibri"/><w:sz w:val="22"/><w:szCs w:val="22"/></w:rPr></w:pPr><w:r><w:rPr><w:rFonts w:eastAsia="Calibri"/><w:sz w:val="22"/><w:szCs w:val="22"/></w:rPr><w:t xml:space="preserve">DECLARAMOS mediante la presente nuestra calidad de Garantes a nombre del Proveedor y a favor del Comprador, por un monto máximo de ${garantia_monto} y nos obligamos a pagar al Comprador, contra su primera solicitud escrita, en que se afirme que el Proveedor no ha cumplido con alguna obligación establecida en el Contrato, sin argumentaciones ni objeciones, cualquier suma o sumas dentro de los límites de ${garantia_monto}, sin necesidad de que el Comprador pruebe o acredite la causa o razones que sustentan la reclamación de la suma o sumas indicadas. </w:t></w:r></w:p><w:p><w:pPr><w:spacing w:line="240" w:lineRule="auto"/><w:jc w:val="both"/><w:rPr><w:rFonts w:eastAsia="Calibri"/><w:sz w:val="22"/><w:szCs w:val="22"/></w:rPr></w:pPr></w:p><w:p><w:pPr><w:pStyle w:val="Textoindependiente2"/><w:autoSpaceDE w:val="0"/><w:autoSpaceDN w:val="0"/><w:adjustRightInd w:val="0"/><w:rPr><w:rFonts w:ascii="Arial" w:hAnsi="Arial" w:cs="Arial"/><w:sz w:val="22"/><w:szCs w:val="22"/></w:rPr></w:pPr><w:r><w:rPr><w:rFonts w:ascii="Arial" w:hAnsi="Arial" w:cs="Arial"/><w:b/><w:sz w:val="22"/><w:szCs w:val="22"/></w:rPr><w:t>CONVENIMOS</w:t></w:r><w:r><w:rPr><w:rFonts w:ascii="Arial" w:hAnsi="Arial" w:cs="Arial"/><w:sz w:val="22"/><w:szCs w:val="22"/></w:rPr><w:t xml:space="preserve"> además en que ningún cambio o adición, ni ninguna otra modificación de las condiciones del Contrato o de los bienes que han de adquirirse en virtud del mismo, o de cualquiera de los documentos contractuales, que pudieran acordar el Comprador y el Contratista nos liberará de ninguna obligación que nos incumba en virtud de la presente garantía, y por la presente renunciamos a la notificación de toda modificación, adición o cambio.</w:t></w:r></w:p><w:p><w:pPr><w:pStyle w:val="Textoindependiente2"/><w:autoSpaceDE w:val="0"/><w:autoSpaceDN w:val="0"/><w:adjustRightInd w:val="0"/><w:rPr><w:rFonts w:ascii="Arial" w:hAnsi="Arial" w:cs="Arial"/><w:sz w:val="22"/><w:szCs w:val="22"/></w:rPr></w:pPr></w:p><w:p><w:pPr><w:spacing w:after="0" w:line="240" w:lineRule="auto"/><w:jc w:val="both"/><w:rPr><w:rFonts w:eastAsia="Calibri"/><w:color w:val="FF0000"/><w:sz w:val="22"/><w:szCs w:val="22"/></w:rPr></w:pPr><w:r><w:rPr><w:rFonts w:eastAsia="Calibri"/><w:color w:val="FF0000"/><w:sz w:val="22"/><w:szCs w:val="22"/></w:rPr><w:t xml:space="preserve">Esta garantía es válida hasta el día ${dia} (${dia_letras}) del ${mes} del ${anio} (${anio_letras}).</w:t></w:r></w:p><w:p><w:pPr><w:spacing w:line="240" w:lineRule="auto"/><w:jc w:val="both"/><w:rPr><w:rFonts w:eastAsia="Calibri"/><w:color w:val="FF0000"/><w:sz w:val="22"/><w:szCs w:val="22"/></w:rPr></w:pPr></w:p><w:p><w:pPr><w:spacing w:line="240" w:lineRule="auto"/><w:jc w:val="both"/><w:rPr><w:rFonts w:eastAsia="Calibri"/><w:sz w:val="22"/><w:szCs w:val="22"/></w:rPr></w:pPr><w:r><w:rPr><w:rFonts w:eastAsia="Calibri"/><w:sz w:val="22"/><w:szCs w:val="22"/></w:rPr><w:t>1. Firmas Autorizadas</w:t></w:r><w:r><w:rPr><w:sz w:val="22"/><w:szCs w:val="22"/></w:rPr><w:t>.</w:t></w:r></w:p><w:p><w:pPr><w:spacing w:after="0"/><w:jc w:val="both"/><w:rPr><w:rFonts w:eastAsia="Calibri"/><w:bCs/><w:color w:val="000000"/><w:sz w:val="22"/><w:szCs w:val="22"/></w:rPr></w:pPr><w:r><w:rPr><w:rFonts w:eastAsia="Calibri"/><w:sz w:val="22"/><w:szCs w:val="22"/></w:rPr><w:t xml:space="preserve">2. Sello de </w:t></w:r><w:smartTag w:uri="urn:schemas-microsoft-com:office:smarttags" w:element="PersonName"><w:smartTagPr><w:attr w:name="ProductID" w:val="la Entidad"/></w:smartTagPr><w:r><w:rPr><w:rFonts w:eastAsia="Calibri"/><w:sz w:val="22"/><w:szCs w:val="22"/></w:rPr><w:t>la Entidad</w:t></w:r></w:smartTag><w:r><w:rPr><w:rFonts w:eastAsia="Calibri"/><w:sz w:val="22"/><w:szCs w:val="22"/></w:rPr><w:t xml:space="preserve"> Emisora</w:t></w:r><w:r><w:rPr><w:sz w:val="22"/><w:szCs w:val="22"/></w:rPr><w:t>.</w:t></w:r></w:p><w:sectPr><w:footerReference w:type="default" r:id="rId10"/><w:pgSz w:w="11906" w:h="16838" w:code="9"/><w:pgMar w:top="1440" w:right="1440" w:bottom="1440" w:left="1440" w:header="708" w:footer="708" w:gutter="0"/><w:cols w:space="708"/><w:docGrid w:linePitch="360"/></w:sectPr><w:tbl><w:tblPr><w:tblW w:w="0" w:type="auto"/><w:tblBorders><w:top w:val="none" w:sz="0" w:space="0" w:color="auto"/><w:left w:val="none" w:sz="0" w:space="0" w:color="auto"/><w:bottom w:val="none" w:sz="0" w:space="0" w:color="auto"/><w:right w:val="none" w:sz="0" w:space="0" w:color="auto"/><w:insideH w:val="none" w:sz="0" w:space="0" w:color="auto"/><w:insideV w:val="none" w:sz="0" w:space="0" w:color="auto"/></w:tblBorders><w:jc w:val="center"/></w:tblPr><w:tr><w:tc><w:tcPr><w:tcW w:w="4800" w:type="dxa"/><w:vAlign w:val="bottom"/></w:tcPr><w:p><w:pPr><w:jc w:val="center"/></w:pPr><w:r><w:t>${img_firma}</w:t></w:r></w:p></w:tc><w:tc><w:tcPr><w:tcW w:w="4800" w:type="dxa"/><w:vAlign w:val="bottom"/></w:tcPr><w:p><w:pPr><w:jc w:val="center"/></w:pPr><w:r><w:t>${img_sello}</w:t></w:r></w:p></w:tc></w:tr></w:tbl></w:body></w:document>
+<file path=word/document.xml><?xml version="1.0" encoding="utf-8"?>
+<w:document xmlns:wpc="http://schemas.microsoft.com/office/word/2010/wordprocessingCanvas" xmlns:cx="http://schemas.microsoft.com/office/drawing/2014/chartex" xmlns:cx1="http://schemas.microsoft.com/office/drawing/2015/9/8/chartex" xmlns:mc="http://schemas.openxmlformats.org/markup-compatibility/2006" xmlns:o="urn:schemas-microsoft-com:office:office" xmlns:r="http://schemas.openxmlformats.org/officeDocument/2006/relationships" xmlns:m="http://schemas.openxmlformats.org/officeDocument/2006/math" xmlns:v="urn:schemas-microsoft-com:vml" xmlns:wp14="http://schemas.microsoft.com/office/word/2010/wordprocessingDrawing" xmlns:wp="http://schemas.openxmlformats.org/drawingml/2006/wordprocessingDrawing" xmlns:w10="urn:schemas-microsoft-com:office:word" xmlns:w="http://schemas.openxmlformats.org/wordprocessingml/2006/main" xmlns:w14="http://schemas.microsoft.com/office/word/2010/wordml" xmlns:w15="http://schemas.microsoft.com/office/word/2012/wordml" xmlns:w16se="http://schemas.microsoft.com/office/word/2015/wordml/symex" xmlns:wpg="http://schemas.microsoft.com/office/word/2010/wordprocessingGroup" xmlns:wpi="http://schemas.microsoft.com/office/word/2010/wordprocessingInk" xmlns:wne="http://schemas.microsoft.com/office/word/2006/wordml" xmlns:wps="http://schemas.microsoft.com/office/word/2010/wordprocessingShape" mc:Ignorable="w14 w15 w16se wp14">
+  <w:body>
+    <w:p>
+      <w:r>
+        <w:rPr>
+          <w:noProof/>
+          <w:lang w:val="en-US"/>
+        </w:rPr>
+        <w:pict>
+          <v:group id="_x0000_s1045" style="position:absolute;margin-left:354.15pt;margin-top:-34.95pt;width:127.2pt;height:55.2pt;z-index:251697152" coordorigin="12866,523" coordsize="2544,1104">
+            <v:rect id="_x0000_s1046" style="position:absolute;left:12866;top:523;width:2544;height:1104" filled="f"/>
+            <v:group id="_x0000_s1047" style="position:absolute;left:12940;top:561;width:2413;height:968" coordorigin="9151,720" coordsize="2009,900">
+              <v:shapetype id="_x0000_t202" coordsize="21600,21600" o:spt="202" path="m,l,21600r21600,l21600,xe">
+                <v:stroke joinstyle="miter"/>
+                <v:path gradientshapeok="t" o:connecttype="rect"/>
+              </v:shapetype>
+              <v:shape id="_x0000_s1048" type="#_x0000_t202" style="position:absolute;left:9151;top:1077;width:2009;height:543;mso-width-relative:margin;mso-height-relative:margin" fillcolor="white [3212]" strokecolor="white [3212]" strokeweight="2.25pt">
+                <v:textbox style="mso-next-textbox:#_x0000_s1048" inset=",0">
+                  <w:txbxContent>
+                    <w:sdt>
+                      <w:sdtPr>
+                        <w:rPr>
+                          <w:rStyle w:val="Style2"/>
+                        </w:rPr>
+                        <w:alias w:val="No. del Expediente de Compras "/>
+                        <w:tag w:val="No. del Expediente de Compras "/>
+                        <w:id w:val="5755464"/>
+                        <w:showingPlcHdr/>
+                      </w:sdtPr>
+                      <w:sdtEndPr>
+                        <w:rPr>
+                          <w:rStyle w:val="Style2"/>
+                        </w:rPr>
+                      </w:sdtEndPr>
+                      <w:sdtContent>
+                        <w:p>
+                          <w:pPr>
+                            <w:jc w:val="center"/>
+                          </w:pPr>
+                          <w:r>
+                            <w:rPr>
+                              <w:rStyle w:val="Textodelmarcadordeposicin"/>
+                            </w:rPr>
+                            <w:t>${proceso_codigo}</w:t>
+                          </w:r>
+                        </w:p>
+                      </w:sdtContent>
+                    </w:sdt>
+                  </w:txbxContent>
+                </v:textbox>
+              </v:shape>
+              <v:shape id="_x0000_s1049" type="#_x0000_t202" style="position:absolute;left:9151;top:720;width:2009;height:360;mso-width-relative:margin;mso-height-relative:margin" fillcolor="black [3213]" strokecolor="white [3212]" strokeweight="3pt">
+                <v:textbox style="mso-next-textbox:#_x0000_s1049">
+                  <w:txbxContent>
+                    <w:p>
+                      <w:pPr>
+                        <w:jc w:val="center"/>
+                        <w:rPr>
+                          <w:rFonts w:ascii="Franklin Gothic Medium Cond" w:hAnsi="Franklin Gothic Medium Cond"/>
+                          <w:b/>
+                          <w:color w:val="FFFFFF" w:themeColor="background1"/>
+                          <w:lang w:val="en-US"/>
+                        </w:rPr>
+                      </w:pPr>
+                      <w:r>
+                        <w:rPr>
+                          <w:rFonts w:ascii="Franklin Gothic Medium Cond" w:hAnsi="Franklin Gothic Medium Cond"/>
+                          <w:b/>
+                          <w:color w:val="FFFFFF" w:themeColor="background1"/>
+                        </w:rPr>
+                        <w:t>No. EXPEDIENTE</w:t>
+                      </w:r>
+                    </w:p>
+                  </w:txbxContent>
+                </v:textbox>
+              </v:shape>
+            </v:group>
+          </v:group>
+        </w:pict>
+      </w:r>
+      <w:r>
+        <w:rPr>
+          <w:noProof/>
+          <w:lang w:val="es-DO" w:eastAsia="es-DO"/>
+        </w:rPr>
+        <w:drawing>
+          <wp:anchor distT="0" distB="0" distL="114300" distR="114300" simplePos="0" relativeHeight="251698176" behindDoc="0" locked="0" layoutInCell="1" allowOverlap="1">
+            <wp:simplePos x="0" y="0"/>
+            <wp:positionH relativeFrom="margin">
+              <wp:posOffset>2583180</wp:posOffset>
+            </wp:positionH>
+            <wp:positionV relativeFrom="margin">
+              <wp:posOffset>-516255</wp:posOffset>
+            </wp:positionV>
+            <wp:extent cx="882000" cy="878400"/>
+            <wp:effectExtent l="0" t="0" r="0" b="0"/>
+            <wp:wrapSquare wrapText="bothSides"/>
+            <wp:docPr id="3" name="Imagen 3" descr="C:\Users\emontesdeoca\Desktop\Escudo Nacional 2018.png"/>
+            <wp:cNvGraphicFramePr>
+              <a:graphicFrameLocks xmlns:a="http://schemas.openxmlformats.org/drawingml/2006/main" noChangeAspect="1"/>
+            </wp:cNvGraphicFramePr>
+            <a:graphic xmlns:a="http://schemas.openxmlformats.org/drawingml/2006/main">
+              <a:graphicData uri="http://schemas.openxmlformats.org/drawingml/2006/picture">
+                <pic:pic xmlns:pic="http://schemas.openxmlformats.org/drawingml/2006/picture">
+                  <pic:nvPicPr>
+                    <pic:cNvPr id="0" name="Picture 1" descr="C:\Users\emontesdeoca\Desktop\Escudo Nacional 2018.png"/>
+                    <pic:cNvPicPr>
+                      <a:picLocks noChangeAspect="1" noChangeArrowheads="1"/>
+                    </pic:cNvPicPr>
+                  </pic:nvPicPr>
+                  <pic:blipFill>
+                    <a:blip r:embed="rId8" cstate="print">
+                      <a:extLst>
+                        <a:ext uri="{28A0092B-C50C-407E-A947-70E740481C1C}">
+                          <a14:useLocalDpi xmlns:a14="http://schemas.microsoft.com/office/drawing/2010/main" val="0"/>
+                        </a:ext>
+                      </a:extLst>
+                    </a:blip>
+                    <a:srcRect/>
+                    <a:stretch>
+                      <a:fillRect/>
+                    </a:stretch>
+                  </pic:blipFill>
+                  <pic:spPr bwMode="auto">
+                    <a:xfrm>
+                      <a:off x="0" y="0"/>
+                      <a:ext cx="882000" cy="878400"/>
+                    </a:xfrm>
+                    <a:prstGeom prst="rect">
+                      <a:avLst/>
+                    </a:prstGeom>
+                    <a:noFill/>
+                    <a:ln>
+                      <a:noFill/>
+                    </a:ln>
+                  </pic:spPr>
+                </pic:pic>
+              </a:graphicData>
+            </a:graphic>
+            <wp14:sizeRelH relativeFrom="margin">
+              <wp14:pctWidth>0</wp14:pctWidth>
+            </wp14:sizeRelH>
+            <wp14:sizeRelV relativeFrom="margin">
+              <wp14:pctHeight>0</wp14:pctHeight>
+            </wp14:sizeRelV>
+          </wp:anchor>
+        </w:drawing>
+      </w:r>
+      <w:r>
+        <w:rPr>
+          <w:noProof/>
+          <w:lang w:val="en-US" w:eastAsia="zh-TW"/>
+        </w:rPr>
+        <w:pict>
+          <v:shape id="_x0000_s1026" type="#_x0000_t202" style="position:absolute;margin-left:-35.7pt;margin-top:-13.1pt;width:81pt;height:84.9pt;z-index:251661312;mso-position-horizontal-relative:text;mso-position-vertical-relative:text;mso-width-relative:margin;mso-height-relative:margin" filled="f" stroked="f">
+            <v:textbox style="mso-next-textbox:#_x0000_s1026">
+              <w:txbxContent>
+                <w:sdt>
+                  <w:sdtPr>
+                    <w:rPr>
+                      <w:lang w:val="en-US"/>
+                    </w:rPr>
+                    <w:alias w:val="Logo de la dependencia gubernamental"/>
+                    <w:tag w:val="Logo de la dependencia gubernamental"/>
+                    <w:id w:val="13417745"/>
+                    <w:showingPlcHdr/>
+                    <w:picture/>
+                  </w:sdtPr>
+                  <w:sdtEndPr/>
+                  <w:sdtContent>
+                    <w:p>
+                      <w:pPr>
+                        <w:rPr>
+                          <w:lang w:val="en-US"/>
+                        </w:rPr>
+                      </w:pPr>
+                      <w:r>
+                        <w:rPr>
+                          <w:noProof/>
+                          <w:lang w:val="es-DO" w:eastAsia="es-DO"/>
+                        </w:rPr>
+                        <w:drawing>
+                          <wp:inline distT="0" distB="0" distL="0" distR="0">
+                            <wp:extent cx="800100" cy="800100"/>
+                            <wp:effectExtent l="19050" t="0" r="0" b="0"/>
+                            <wp:docPr id="2" name="Picture 1"/>
+                            <wp:cNvGraphicFramePr>
+                              <a:graphicFrameLocks xmlns:a="http://schemas.openxmlformats.org/drawingml/2006/main" noChangeAspect="1"/>
+                            </wp:cNvGraphicFramePr>
+                            <a:graphic xmlns:a="http://schemas.openxmlformats.org/drawingml/2006/main">
+                              <a:graphicData uri="http://schemas.openxmlformats.org/drawingml/2006/picture">
+                                <pic:pic xmlns:pic="http://schemas.openxmlformats.org/drawingml/2006/picture">
+                                  <pic:nvPicPr>
+                                    <pic:cNvPr id="0" name="Picture 1"/>
+                                    <pic:cNvPicPr>
+                                      <a:picLocks noChangeAspect="1" noChangeArrowheads="1"/>
+                                    </pic:cNvPicPr>
+                                  </pic:nvPicPr>
+                                  <pic:blipFill>
+                                    <a:blip r:embed="rId9"/>
+                                    <a:srcRect/>
+                                    <a:stretch>
+                                      <a:fillRect/>
+                                    </a:stretch>
+                                  </pic:blipFill>
+                                  <pic:spPr bwMode="auto">
+                                    <a:xfrm>
+                                      <a:off x="0" y="0"/>
+                                      <a:ext cx="799693" cy="799693"/>
+                                    </a:xfrm>
+                                    <a:prstGeom prst="rect">
+                                      <a:avLst/>
+                                    </a:prstGeom>
+                                    <a:noFill/>
+                                    <a:ln w="9525">
+                                      <a:noFill/>
+                                      <a:miter lim="800000"/>
+                                      <a:headEnd/>
+                                      <a:tailEnd/>
+                                    </a:ln>
+                                  </pic:spPr>
+                                </pic:pic>
+                              </a:graphicData>
+                            </a:graphic>
+                          </wp:inline>
+                        </w:drawing>
+                      </w:r>
+                    </w:p>
+                  </w:sdtContent>
+                </w:sdt>
+              </w:txbxContent>
+            </v:textbox>
+          </v:shape>
+        </w:pict>
+      </w:r>
+      <w:r>
+        <w:rPr>
+          <w:noProof/>
+          <w:lang w:val="en-US"/>
+        </w:rPr>
+        <w:pict>
+          <v:shape id="_x0000_s1044" type="#_x0000_t202" style="position:absolute;margin-left:-27.65pt;margin-top:-39.55pt;width:74.65pt;height:24.05pt;z-index:251696128;mso-position-horizontal-relative:text;mso-position-vertical-relative:text;mso-width-relative:margin;mso-height-relative:margin" filled="f" stroked="f">
+            <v:textbox style="mso-next-textbox:#_x0000_s1044" inset="0,0,0,0">
+              <w:txbxContent>
+                <w:p>
+                  <w:pPr>
+                    <w:rPr>
+                      <w:rFonts w:ascii="Arial Narrow" w:hAnsi="Arial Narrow"/>
+                      <w:b/>
+                      <w:caps/>
+                      <w:color w:val="C00000"/>
+                      <w:spacing w:val="-8"/>
+                      <w:sz w:val="22"/>
+                      <w:szCs w:val="12"/>
+                    </w:rPr>
+                  </w:pPr>
+                  <w:r>
+                    <w:rPr>
+                      <w:rStyle w:val="Style15"/>
+                      <w:rFonts w:cstheme="minorBidi"/>
+                      <w:b/>
+                      <w:color w:val="C00000"/>
+                      <w:sz w:val="22"/>
+                    </w:rPr>
+                    <w:t>SNCC.D.038</w:t>
+                  </w:r>
+                </w:p>
+              </w:txbxContent>
+            </v:textbox>
+          </v:shape>
+        </w:pict>
+      </w:r>
+      <w:r>
+        <w:t xml:space="preserve">                                       </w:t>
+      </w:r>
+      <w:bookmarkStart w:id="0" w:name="_GoBack"/>
+      <w:bookmarkEnd w:id="0"/>
+    </w:p>
+    <w:p>
+      <w:r>
+        <w:rPr>
+          <w:rStyle w:val="Institucion"/>
+          <w:color w:val="FF0000"/>
+          <w:sz w:val="28"/>
+          <w:lang w:eastAsia="zh-TW"/>
+        </w:rPr>
+        <w:pict>
+          <v:shape id="_x0000_s1040" type="#_x0000_t202" style="position:absolute;margin-left:122.85pt;margin-top:16.5pt;width:252.3pt;height:22pt;z-index:251691008;mso-width-relative:margin;mso-height-relative:margin" stroked="f">
+            <v:textbox>
+              <w:txbxContent>
+                <w:p>
+                  <w:pPr>
+                    <w:rPr>
+                      <w:lang w:val="es-ES_tradnl"/>
+                    </w:rPr>
+                  </w:pPr>
+                  <w:sdt>
+                    <w:sdtPr>
+                      <w:rPr>
+                        <w:rStyle w:val="Style6"/>
+                        <w:sz w:val="24"/>
+                        <w:szCs w:val="24"/>
+                      </w:rPr>
+                      <w:alias w:val="Nombre de la Institución"/>
+                      <w:tag w:val="Nombre de la Institución"/>
+                      <w:id w:val="8389551"/>
+                    </w:sdtPr>
+                    <w:sdtEndPr>
+                      <w:rPr>
+                        <w:rStyle w:val="Style6"/>
+                      </w:rPr>
+                    </w:sdtEndPr>
+                    <w:sdtContent>
+                      <w:r>
+                        <w:rPr>
+                          <w:rStyle w:val="Style6"/>
+                          <w:sz w:val="24"/>
+                          <w:szCs w:val="24"/>
+                        </w:rPr>
+                        <w:t>${entidad_nombre}</w:t>
+                      </w:r>
+                      <w:r>
+                        <w:rPr>
+                          <w:rStyle w:val="Style6"/>
+                          <w:sz w:val="24"/>
+                          <w:szCs w:val="24"/>
+                        </w:rPr>
+                        <w:t/>
+                      </w:r>
+                      <w:r>
+                        <w:rPr>
+                          <w:rStyle w:val="Style6"/>
+                          <w:sz w:val="24"/>
+                          <w:szCs w:val="24"/>
+                        </w:rPr>
+                        <w:t xml:space="preserve"/>
+                      </w:r>
+                    </w:sdtContent>
+                  </w:sdt>
+                </w:p>
+              </w:txbxContent>
+            </v:textbox>
+          </v:shape>
+        </w:pict>
+      </w:r>
+      <w:r>
+        <w:rPr>
+          <w:noProof/>
+          <w:lang w:val="en-US" w:eastAsia="zh-TW"/>
+        </w:rPr>
+        <w:pict>
+          <v:shape id="_x0000_s1036" type="#_x0000_t202" style="position:absolute;margin-left:375.15pt;margin-top:2.5pt;width:112.45pt;height:21.9pt;z-index:251685888;mso-width-relative:margin;mso-height-relative:margin" filled="f" stroked="f">
+            <v:textbox style="mso-next-textbox:#_x0000_s1036">
+              <w:txbxContent>
+                <w:p>
+                  <w:sdt>
+                    <w:sdtPr>
+                      <w:rPr>
+                        <w:rStyle w:val="Style5"/>
+                      </w:rPr>
+                      <w:alias w:val="Fecha de emisión del documento"/>
+                      <w:tag w:val="Fecha de emisión del documento"/>
+                      <w:id w:val="13417894"/>
+                      <w:date>
+                        <w:dateFormat w:val="dd' de 'MMMM' de 'yyyy"/>
+                        <w:lid w:val="es-DO"/>
+                        <w:storeMappedDataAs w:val="dateTime"/>
+                        <w:calendar w:val="gregorian"/>
+                      </w:date>
+                    </w:sdtPr>
+                    <w:sdtEndPr>
+                      <w:rPr>
+                        <w:rStyle w:val="Style5"/>
+                      </w:rPr>
+                    </w:sdtEndPr>
+                    <w:sdtContent>
+                      <w:r>
+                        <w:rPr>
+                          <w:rStyle w:val="Style5"/>
+                        </w:rPr>
+                        <w:t xml:space="preserve">${fecha} </w:t>
+                      </w:r>
+                    </w:sdtContent>
+                  </w:sdt>
+                </w:p>
+              </w:txbxContent>
+            </v:textbox>
+          </v:shape>
+        </w:pict>
+      </w:r>
+    </w:p>
+    <w:p>
+      <w:r>
+        <w:rPr>
+          <w:noProof/>
+          <w:color w:val="FF0000"/>
+          <w:lang w:eastAsia="zh-TW"/>
+        </w:rPr>
+        <w:pict>
+          <v:shape id="_x0000_s1042" type="#_x0000_t202" style="position:absolute;margin-left:96.85pt;margin-top:16.6pt;width:272.95pt;height:21.85pt;z-index:251695104;mso-width-relative:margin;mso-height-relative:margin" stroked="f">
+            <v:textbox style="mso-next-textbox:#_x0000_s1042">
+              <w:txbxContent>
+                <w:p>
+                  <w:pPr>
+                    <w:jc w:val="center"/>
+                    <w:rPr>
+                      <w:rFonts w:asciiTheme="minorHAnsi" w:hAnsiTheme="minorHAnsi"/>
+                      <w:lang w:val="es-ES_tradnl"/>
+                    </w:rPr>
+                  </w:pPr>
+                  <w:r>
+                    <w:rPr>
+                      <w:rStyle w:val="Style7"/>
+                      <w:rFonts w:asciiTheme="minorHAnsi" w:hAnsiTheme="minorHAnsi"/>
+                      <w:lang w:val="es-ES_tradnl"/>
+                    </w:rPr>
+                    <w:t xml:space="preserve">garantía </w:t>
+                  </w:r>
+                  <w:r>
+                    <w:rPr>
+                      <w:rStyle w:val="Style7"/>
+                      <w:rFonts w:asciiTheme="minorHAnsi" w:hAnsiTheme="minorHAnsi"/>
+                      <w:lang w:val="es-ES_tradnl"/>
+                    </w:rPr>
+                    <w:t>de fiel cumplimiento de contrato</w:t>
+                  </w:r>
+                  <w:r>
+                    <w:rPr>
+                      <w:rStyle w:val="Style7"/>
+                      <w:rFonts w:asciiTheme="minorHAnsi" w:hAnsiTheme="minorHAnsi"/>
+                      <w:lang w:val="es-ES_tradnl"/>
+                    </w:rPr>
+                    <w:t xml:space="preserve"> </w:t>
+                  </w:r>
+                </w:p>
+              </w:txbxContent>
+            </v:textbox>
+          </v:shape>
+        </w:pict>
+      </w:r>
+      <w:r>
+        <w:rPr>
+          <w:noProof/>
+          <w:sz w:val="24"/>
+          <w:szCs w:val="24"/>
+          <w:lang w:eastAsia="es-ES"/>
+        </w:rPr>
+        <w:pict>
+          <v:shape id="_x0000_s1037" type="#_x0000_t202" style="position:absolute;margin-left:402.5pt;margin-top:7.3pt;width:89pt;height:19.85pt;z-index:251686912;mso-width-relative:margin;mso-height-relative:margin" filled="f" stroked="f">
+            <v:textbox style="mso-next-textbox:#_x0000_s1037">
+              <w:txbxContent>
+                <w:p>
+                  <w:pPr>
+                    <w:rPr>
+                      <w:sz w:val="22"/>
+                      <w:szCs w:val="22"/>
+                    </w:rPr>
+                  </w:pPr>
+                  <w:r>
+                    <w:rPr>
+                      <w:sz w:val="22"/>
+                      <w:szCs w:val="22"/>
+                    </w:rPr>
+                    <w:t xml:space="preserve">Página </w:t>
+                  </w:r>
+                  <w:r>
+                    <w:rPr>
+                      <w:b/>
+                      <w:sz w:val="22"/>
+                      <w:szCs w:val="22"/>
+                    </w:rPr>
+                    <w:fldChar w:fldCharType="begin"/>
+                  </w:r>
+                  <w:r>
+                    <w:rPr>
+                      <w:b/>
+                      <w:sz w:val="22"/>
+                      <w:szCs w:val="22"/>
+                    </w:rPr>
+                    <w:instrText xml:space="preserve"> PAGE   \* MERGEFORMAT </w:instrText>
+                  </w:r>
+                  <w:r>
+                    <w:rPr>
+                      <w:b/>
+                      <w:sz w:val="22"/>
+                      <w:szCs w:val="22"/>
+                    </w:rPr>
+                    <w:fldChar w:fldCharType="separate"/>
+                  </w:r>
+                  <w:r>
+                    <w:rPr>
+                      <w:b/>
+                      <w:noProof/>
+                      <w:sz w:val="22"/>
+                      <w:szCs w:val="22"/>
+                    </w:rPr>
+                    <w:t>1</w:t>
+                  </w:r>
+                  <w:r>
+                    <w:rPr>
+                      <w:b/>
+                      <w:sz w:val="22"/>
+                      <w:szCs w:val="22"/>
+                    </w:rPr>
+                    <w:fldChar w:fldCharType="end"/>
+                  </w:r>
+                  <w:r>
+                    <w:rPr>
+                      <w:sz w:val="22"/>
+                      <w:szCs w:val="22"/>
+                    </w:rPr>
+                    <w:t xml:space="preserve"> de </w:t>
+                  </w:r>
+                  <w:fldSimple w:instr=" NUMPAGES   \* MERGEFORMAT ">
+                    <w:r>
+                      <w:rPr>
+                        <w:b/>
+                        <w:noProof/>
+                        <w:sz w:val="22"/>
+                        <w:szCs w:val="22"/>
+                      </w:rPr>
+                      <w:t>1</w:t>
+                    </w:r>
+                  </w:fldSimple>
+                </w:p>
+              </w:txbxContent>
+            </v:textbox>
+          </v:shape>
+        </w:pict>
+      </w:r>
+    </w:p>
+    <w:p>
+      <w:pPr>
+        <w:tabs>
+          <w:tab w:val="left" w:pos="6267"/>
+        </w:tabs>
+        <w:spacing w:after="0" w:line="240" w:lineRule="auto"/>
+        <w:jc w:val="center"/>
+      </w:pPr>
+    </w:p>
+    <w:p>
+      <w:pPr>
+        <w:tabs>
+          <w:tab w:val="left" w:pos="6267"/>
+        </w:tabs>
+        <w:jc w:val="center"/>
+        <w:rPr>
+          <w:sz w:val="24"/>
+          <w:szCs w:val="24"/>
+        </w:rPr>
+      </w:pPr>
+    </w:p>
+    <w:p>
+      <w:pPr>
+        <w:spacing w:after="0" w:line="240" w:lineRule="auto"/>
+        <w:jc w:val="both"/>
+        <w:rPr>
+          <w:rFonts w:eastAsia="Calibri"/>
+          <w:sz w:val="22"/>
+          <w:szCs w:val="22"/>
+        </w:rPr>
+      </w:pPr>
+      <w:r>
+        <w:rPr>
+          <w:rFonts w:eastAsia="Calibri"/>
+          <w:sz w:val="22"/>
+          <w:szCs w:val="22"/>
+        </w:rPr>
+        <w:t>Señores</w:t>
+      </w:r>
+    </w:p>
+    <w:p>
+      <w:pPr>
+        <w:spacing w:after="0" w:line="240" w:lineRule="auto"/>
+        <w:jc w:val="both"/>
+        <w:rPr>
+          <w:rFonts w:eastAsia="Calibri"/>
+          <w:color w:val="FF0000"/>
+          <w:sz w:val="22"/>
+          <w:szCs w:val="22"/>
+        </w:rPr>
+      </w:pPr>
+      <w:r>
+        <w:rPr>
+          <w:rStyle w:val="Style35"/>
+        </w:rPr>
+        <w:t>${entidad_nombre}</w:t>
+      </w:r>
+      <w:r>
+        <w:rPr>
+          <w:rStyle w:val="Style35"/>
+        </w:rPr>
+        <w:t/>
+      </w:r>
+      <w:r>
+        <w:rPr>
+          <w:rStyle w:val="Style35"/>
+        </w:rPr>
+        <w:t/>
+      </w:r>
+    </w:p>
+    <w:p>
+      <w:pPr>
+        <w:spacing w:after="0"/>
+        <w:jc w:val="both"/>
+        <w:rPr>
+          <w:rFonts w:eastAsia="Calibri"/>
+          <w:sz w:val="22"/>
+          <w:szCs w:val="22"/>
+        </w:rPr>
+      </w:pPr>
+    </w:p>
+    <w:p>
+      <w:pPr>
+        <w:pStyle w:val="Textoindependiente2"/>
+        <w:rPr>
+          <w:rFonts w:ascii="Arial" w:hAnsi="Arial" w:cs="Arial"/>
+          <w:sz w:val="22"/>
+          <w:szCs w:val="22"/>
+        </w:rPr>
+      </w:pPr>
+      <w:r>
+        <w:rPr>
+          <w:rFonts w:ascii="Arial" w:hAnsi="Arial" w:cs="Arial"/>
+          <w:b/>
+          <w:sz w:val="22"/>
+          <w:szCs w:val="22"/>
+        </w:rPr>
+        <w:t>POR CUANTO</w:t>
+      </w:r>
+      <w:r>
+        <w:rPr>
+          <w:rStyle w:val="Style36"/>
+        </w:rPr>
+        <w:t xml:space="preserve"> </w:t>
+      </w:r>
+      <w:r>
+        <w:rPr>
+          <w:rStyle w:val="Style36"/>
+          <w:color w:val="FF0000"/>
+        </w:rPr>
+        <w:t>${contratista_nombre}</w:t>
+      </w:r>
+      <w:r>
+        <w:rPr>
+          <w:rFonts w:ascii="Arial" w:hAnsi="Arial" w:cs="Arial"/>
+          <w:sz w:val="22"/>
+          <w:szCs w:val="22"/>
+        </w:rPr>
+        <w:t xml:space="preserve"> (en lo sucesivo denominado “el Proveedor”) se ha obligado, en virtud del Contrato Nº</w:t>
+      </w:r>
+      <w:r>
+        <w:rPr>
+          <w:rStyle w:val="Style36"/>
+        </w:rPr>
+        <w:t xml:space="preserve"> </w:t>
+      </w:r>
+      <w:r>
+        <w:rPr>
+          <w:rStyle w:val="Style36"/>
+          <w:color w:val="FF0000"/>
+        </w:rPr>
+        <w:t>${contrato_numero}</w:t>
+      </w:r>
+      <w:r>
+        <w:rPr>
+          <w:rStyle w:val="Style36"/>
+          <w:color w:val="FF0000"/>
+        </w:rPr>
+        <w:t/>
+      </w:r>
+      <w:r>
+        <w:rPr>
+          <w:rFonts w:ascii="Arial" w:hAnsi="Arial" w:cs="Arial"/>
+          <w:sz w:val="22"/>
+          <w:szCs w:val="22"/>
+        </w:rPr>
+        <w:t xml:space="preserve"> de fecha</w:t>
+      </w:r>
+      <w:r>
+        <w:rPr>
+          <w:rStyle w:val="Style36"/>
+        </w:rPr>
+        <w:t xml:space="preserve"> </w:t>
+      </w:r>
+      <w:r>
+        <w:rPr>
+          <w:rStyle w:val="Style36"/>
+          <w:color w:val="FF0000"/>
+        </w:rPr>
+        <w:t>${contrato_fecha}</w:t>
+      </w:r>
+      <w:r>
+        <w:rPr>
+          <w:rFonts w:ascii="Arial" w:hAnsi="Arial" w:cs="Arial"/>
+          <w:sz w:val="22"/>
+          <w:szCs w:val="22"/>
+        </w:rPr>
+        <w:t xml:space="preserve"> a suministrar a</w:t>
+      </w:r>
+      <w:r>
+        <w:rPr>
+          <w:rStyle w:val="Style36"/>
+        </w:rPr>
+        <w:t xml:space="preserve"> </w:t>
+      </w:r>
+      <w:r>
+        <w:rPr>
+          <w:rStyle w:val="Style36"/>
+          <w:color w:val="FF0000"/>
+        </w:rPr>
+        <w:t>${proceso_entidad}</w:t>
+      </w:r>
+      <w:r>
+        <w:rPr>
+          <w:rFonts w:ascii="Arial" w:hAnsi="Arial" w:cs="Arial"/>
+          <w:sz w:val="22"/>
+          <w:szCs w:val="22"/>
+        </w:rPr>
+        <w:t xml:space="preserve"> (en lo sucesivo denominado “el Comprador”). </w:t>
+      </w:r>
+    </w:p>
+    <w:p>
+      <w:pPr>
+        <w:spacing w:line="240" w:lineRule="auto"/>
+        <w:jc w:val="both"/>
+        <w:rPr>
+          <w:b/>
+          <w:sz w:val="22"/>
+          <w:szCs w:val="22"/>
+        </w:rPr>
+      </w:pPr>
+    </w:p>
+    <w:p>
+      <w:pPr>
+        <w:spacing w:line="240" w:lineRule="auto"/>
+        <w:jc w:val="both"/>
+        <w:rPr>
+          <w:rFonts w:eastAsia="Calibri"/>
+          <w:sz w:val="22"/>
+          <w:szCs w:val="22"/>
+        </w:rPr>
+      </w:pPr>
+      <w:r>
+        <w:rPr>
+          <w:rFonts w:eastAsia="Calibri"/>
+          <w:b/>
+          <w:sz w:val="22"/>
+          <w:szCs w:val="22"/>
+        </w:rPr>
+        <w:t>POR CUANTO</w:t>
+      </w:r>
+      <w:r>
+        <w:rPr>
+          <w:rFonts w:eastAsia="Calibri"/>
+          <w:sz w:val="22"/>
+          <w:szCs w:val="22"/>
+        </w:rPr>
+        <w:t xml:space="preserve"> se ha convenido en dicho Contrato que el Proveedor le suministrará una garantía bancaria,  emitida a su favor por un garante de prestigio,  por la suma establecida  en el mismo, con el objeto de garantizar el fiel cumplimiento por parte del Proveedor de todas las obligaciones que le competen en virtud del mencionado Contrato.</w:t>
+      </w:r>
+    </w:p>
+    <w:p>
+      <w:pPr>
+        <w:spacing w:after="0" w:line="240" w:lineRule="auto"/>
+        <w:jc w:val="both"/>
+        <w:rPr>
+          <w:rFonts w:eastAsia="Calibri"/>
+          <w:sz w:val="22"/>
+          <w:szCs w:val="22"/>
+        </w:rPr>
+      </w:pPr>
+      <w:r>
+        <w:rPr>
+          <w:rFonts w:eastAsia="Calibri"/>
+          <w:b/>
+          <w:sz w:val="22"/>
+          <w:szCs w:val="22"/>
+        </w:rPr>
+        <w:t>POR CUANTO</w:t>
+      </w:r>
+      <w:r>
+        <w:rPr>
+          <w:rFonts w:eastAsia="Calibri"/>
+          <w:sz w:val="22"/>
+          <w:szCs w:val="22"/>
+        </w:rPr>
+        <w:t xml:space="preserve"> los suscritos</w:t>
+      </w:r>
+      <w:r>
+        <w:rPr>
+          <w:rStyle w:val="Style36"/>
+        </w:rPr>
+        <w:t xml:space="preserve"> </w:t>
+      </w:r>
+      <w:r>
+        <w:rPr>
+          <w:rStyle w:val="Style36"/>
+          <w:color w:val="FF0000"/>
+        </w:rPr>
+        <w:t>${garante_nombre}</w:t>
+      </w:r>
+      <w:r>
+        <w:rPr>
+          <w:rFonts w:eastAsia="Calibri"/>
+          <w:sz w:val="22"/>
+          <w:szCs w:val="22"/>
+        </w:rPr>
+        <w:t xml:space="preserve"> (en lo sucesivo denominados “el Garante”</w:t>
+      </w:r>
+      <w:r>
+        <w:rPr>
+          <w:rFonts w:eastAsia="Calibri"/>
+          <w:i/>
+          <w:iCs/>
+          <w:sz w:val="22"/>
+          <w:szCs w:val="22"/>
+        </w:rPr>
+        <w:t>)</w:t>
+      </w:r>
+      <w:r>
+        <w:rPr>
+          <w:rFonts w:eastAsia="Calibri"/>
+          <w:sz w:val="22"/>
+          <w:szCs w:val="22"/>
+        </w:rPr>
+        <w:t xml:space="preserve">, hemos convenido en proporcionar al Proveedor una garantía en beneficio del Comprador. </w:t>
+      </w:r>
+    </w:p>
+    <w:p>
+      <w:pPr>
+        <w:spacing w:line="240" w:lineRule="auto"/>
+        <w:jc w:val="both"/>
+        <w:rPr>
+          <w:rFonts w:eastAsia="Calibri"/>
+          <w:sz w:val="22"/>
+          <w:szCs w:val="22"/>
+        </w:rPr>
+      </w:pPr>
+    </w:p>
+    <w:p>
+      <w:pPr>
+        <w:spacing w:after="0" w:line="240" w:lineRule="auto"/>
+        <w:jc w:val="both"/>
+        <w:rPr>
+          <w:rFonts w:eastAsia="Calibri"/>
+          <w:sz w:val="22"/>
+          <w:szCs w:val="22"/>
+        </w:rPr>
+      </w:pPr>
+      <w:r>
+        <w:rPr>
+          <w:rFonts w:eastAsia="Calibri"/>
+          <w:b/>
+          <w:sz w:val="22"/>
+          <w:szCs w:val="22"/>
+        </w:rPr>
+        <w:t>DECLARAMOS</w:t>
+      </w:r>
+      <w:r>
+        <w:rPr>
+          <w:rFonts w:eastAsia="Calibri"/>
+          <w:sz w:val="22"/>
+          <w:szCs w:val="22"/>
+        </w:rPr>
+        <w:t xml:space="preserve"> mediante la presente nuestra calidad de Garantes a nombre del </w:t>
+      </w:r>
+      <w:r>
+        <w:rPr>
+          <w:rFonts w:eastAsia="Calibri"/>
+          <w:b/>
+          <w:sz w:val="22"/>
+          <w:szCs w:val="22"/>
+        </w:rPr>
+        <w:t>Proveedor</w:t>
+      </w:r>
+      <w:r>
+        <w:rPr>
+          <w:rFonts w:eastAsia="Calibri"/>
+          <w:sz w:val="22"/>
+          <w:szCs w:val="22"/>
+        </w:rPr>
+        <w:t xml:space="preserve"> y a favor del </w:t>
+      </w:r>
+      <w:r>
+        <w:rPr>
+          <w:rFonts w:eastAsia="Calibri"/>
+          <w:b/>
+          <w:sz w:val="22"/>
+          <w:szCs w:val="22"/>
+        </w:rPr>
+        <w:t>Comprador,</w:t>
+      </w:r>
+      <w:r>
+        <w:rPr>
+          <w:rFonts w:eastAsia="Calibri"/>
+          <w:sz w:val="22"/>
+          <w:szCs w:val="22"/>
+        </w:rPr>
+        <w:t xml:space="preserve"> por un monto máximo de</w:t>
+      </w:r>
+      <w:r>
+        <w:rPr>
+          <w:rFonts w:eastAsia="Calibri"/>
+          <w:sz w:val="22"/>
+          <w:szCs w:val="22"/>
+        </w:rPr>
+        <w:t xml:space="preserve"> </w:t>
+      </w:r>
+      <w:r>
+        <w:rPr>
+          <w:rStyle w:val="Style36"/>
+          <w:color w:val="FF0000"/>
+        </w:rPr>
+        <w:t xml:space="preserve">(indicar </w:t>
+      </w:r>
+      <w:r>
+        <w:rPr>
+          <w:rStyle w:val="Style36"/>
+          <w:color w:val="FF0000"/>
+        </w:rPr>
+        <w:t>${garantia_monto}</w:t>
+      </w:r>
+      <w:r>
+        <w:rPr>
+          <w:rStyle w:val="Style36"/>
+          <w:color w:val="FF0000"/>
+        </w:rPr>
+        <w:t>)</w:t>
+      </w:r>
+      <w:r>
+        <w:rPr>
+          <w:rFonts w:eastAsia="Calibri"/>
+          <w:sz w:val="22"/>
+          <w:szCs w:val="22"/>
+        </w:rPr>
+        <w:t xml:space="preserve"> y nos obligamos a pagar al Comprador, contra su primera solicitud escrita, en que se afirme que el Proveedor no ha cumplido con alguna obligación establecida en el Contrato, sin argumentaciones ni objeciones, cualquier suma o sumas dentro de los límites de</w:t>
+      </w:r>
+      <w:r>
+        <w:rPr>
+          <w:rFonts w:eastAsia="Calibri"/>
+          <w:sz w:val="22"/>
+          <w:szCs w:val="22"/>
+        </w:rPr>
+        <w:t xml:space="preserve"> </w:t>
+      </w:r>
+      <w:r>
+        <w:rPr>
+          <w:rStyle w:val="Style36"/>
+          <w:color w:val="FF0000"/>
+        </w:rPr>
+        <w:t xml:space="preserve">(indicar </w:t>
+      </w:r>
+      <w:r>
+        <w:rPr>
+          <w:rStyle w:val="Style36"/>
+          <w:color w:val="FF0000"/>
+        </w:rPr>
+        <w:t>${garantia_monto}</w:t>
+      </w:r>
+      <w:r>
+        <w:rPr>
+          <w:rStyle w:val="Style36"/>
+          <w:color w:val="FF0000"/>
+        </w:rPr>
+        <w:t>)</w:t>
+      </w:r>
+      <w:r>
+        <w:rPr>
+          <w:rFonts w:eastAsia="Calibri"/>
+          <w:sz w:val="22"/>
+          <w:szCs w:val="22"/>
+        </w:rPr>
+        <w:t xml:space="preserve">, sin necesidad de que el Comprador pruebe o acredite la causa o razones que sustentan la reclamación de la suma o sumas indicadas. </w:t>
+      </w:r>
+    </w:p>
+    <w:p>
+      <w:pPr>
+        <w:spacing w:line="240" w:lineRule="auto"/>
+        <w:jc w:val="both"/>
+        <w:rPr>
+          <w:rFonts w:eastAsia="Calibri"/>
+          <w:sz w:val="22"/>
+          <w:szCs w:val="22"/>
+        </w:rPr>
+      </w:pPr>
+    </w:p>
+    <w:p>
+      <w:pPr>
+        <w:pStyle w:val="Textoindependiente2"/>
+        <w:autoSpaceDE w:val="0"/>
+        <w:autoSpaceDN w:val="0"/>
+        <w:adjustRightInd w:val="0"/>
+        <w:rPr>
+          <w:rFonts w:ascii="Arial" w:hAnsi="Arial" w:cs="Arial"/>
+          <w:sz w:val="22"/>
+          <w:szCs w:val="22"/>
+        </w:rPr>
+      </w:pPr>
+      <w:r>
+        <w:rPr>
+          <w:rFonts w:ascii="Arial" w:hAnsi="Arial" w:cs="Arial"/>
+          <w:b/>
+          <w:sz w:val="22"/>
+          <w:szCs w:val="22"/>
+        </w:rPr>
+        <w:t>CONVENIMOS</w:t>
+      </w:r>
+      <w:r>
+        <w:rPr>
+          <w:rFonts w:ascii="Arial" w:hAnsi="Arial" w:cs="Arial"/>
+          <w:sz w:val="22"/>
+          <w:szCs w:val="22"/>
+        </w:rPr>
+        <w:t xml:space="preserve"> además en que ningún cambio o adición, ni ninguna otra modificación de las condiciones del Contrato o de los bienes que han de adquirirse en virtud del mismo, o de cualquiera de los documentos contractuales, que pudieran acordar el Comprador y el Contratista nos liberará de ninguna obligación que nos incumba en virtud de la presente garantía, y por la presente renunciamos a la notificación de toda modificación, adición o cambio.</w:t>
+      </w:r>
+    </w:p>
+    <w:p>
+      <w:pPr>
+        <w:pStyle w:val="Textoindependiente2"/>
+        <w:autoSpaceDE w:val="0"/>
+        <w:autoSpaceDN w:val="0"/>
+        <w:adjustRightInd w:val="0"/>
+        <w:rPr>
+          <w:rFonts w:ascii="Arial" w:hAnsi="Arial" w:cs="Arial"/>
+          <w:sz w:val="22"/>
+          <w:szCs w:val="22"/>
+        </w:rPr>
+      </w:pPr>
+    </w:p>
+    <w:p>
+      <w:pPr>
+        <w:spacing w:after="0" w:line="240" w:lineRule="auto"/>
+        <w:jc w:val="both"/>
+        <w:rPr>
+          <w:rFonts w:eastAsia="Calibri"/>
+          <w:color w:val="FF0000"/>
+          <w:sz w:val="22"/>
+          <w:szCs w:val="22"/>
+        </w:rPr>
+      </w:pPr>
+      <w:r>
+        <w:rPr>
+          <w:rFonts w:eastAsia="Calibri"/>
+          <w:sz w:val="22"/>
+          <w:szCs w:val="22"/>
+        </w:rPr>
+        <w:t>Esta garantía es válida hasta el día</w:t>
+      </w:r>
+      <w:r>
+        <w:rPr>
+          <w:rFonts w:eastAsia="Calibri"/>
+          <w:sz w:val="22"/>
+          <w:szCs w:val="22"/>
+        </w:rPr>
+        <w:t xml:space="preserve"> </w:t>
+      </w:r>
+      <w:r>
+        <w:rPr>
+          <w:rFonts w:eastAsia="Calibri"/>
+          <w:color w:val="FF0000"/>
+          <w:sz w:val="22"/>
+          <w:szCs w:val="22"/>
+        </w:rPr>
+        <w:t/>
+      </w:r>
+      <w:r>
+        <w:rPr>
+          <w:rStyle w:val="Style36"/>
+          <w:color w:val="FF0000"/>
+        </w:rPr>
+        <w:t>${dia}</w:t>
+      </w:r>
+      <w:r>
+        <w:rPr>
+          <w:rFonts w:eastAsia="Calibri"/>
+          <w:sz w:val="22"/>
+          <w:szCs w:val="22"/>
+        </w:rPr>
+        <w:t xml:space="preserve"> </w:t>
+      </w:r>
+      <w:r>
+        <w:rPr>
+          <w:rFonts w:eastAsia="Calibri"/>
+          <w:sz w:val="22"/>
+          <w:szCs w:val="22"/>
+        </w:rPr>
+        <w:t>del</w:t>
+      </w:r>
+      <w:r>
+        <w:rPr>
+          <w:rStyle w:val="Style36"/>
+        </w:rPr>
+        <w:t xml:space="preserve"> </w:t>
+      </w:r>
+      <w:r>
+        <w:rPr>
+          <w:rStyle w:val="Style36"/>
+          <w:color w:val="FF0000"/>
+        </w:rPr>
+        <w:t>${mes}</w:t>
+      </w:r>
+      <w:r>
+        <w:rPr>
+          <w:rFonts w:eastAsia="Calibri"/>
+          <w:sz w:val="22"/>
+          <w:szCs w:val="22"/>
+        </w:rPr>
+        <w:t xml:space="preserve"> del</w:t>
+      </w:r>
+      <w:r>
+        <w:rPr>
+          <w:rStyle w:val="Style36"/>
+        </w:rPr>
+        <w:t xml:space="preserve"> </w:t>
+      </w:r>
+      <w:r>
+        <w:rPr>
+          <w:rStyle w:val="Style36"/>
+          <w:color w:val="FF0000"/>
+        </w:rPr>
+        <w:t>${anio}</w:t>
+      </w:r>
+      <w:r>
+        <w:rPr>
+          <w:rFonts w:eastAsia="Calibri"/>
+          <w:sz w:val="22"/>
+          <w:szCs w:val="22"/>
+        </w:rPr>
+        <w:t>.</w:t>
+      </w:r>
+    </w:p>
+    <w:p>
+      <w:pPr>
+        <w:spacing w:line="240" w:lineRule="auto"/>
+        <w:jc w:val="both"/>
+        <w:rPr>
+          <w:rFonts w:eastAsia="Calibri"/>
+          <w:color w:val="FF0000"/>
+          <w:sz w:val="22"/>
+          <w:szCs w:val="22"/>
+        </w:rPr>
+      </w:pPr>
+    </w:p>
+    <w:p>
+      <w:pPr>
+        <w:spacing w:line="240" w:lineRule="auto"/>
+        <w:jc w:val="both"/>
+        <w:rPr>
+          <w:rFonts w:eastAsia="Calibri"/>
+          <w:sz w:val="22"/>
+          <w:szCs w:val="22"/>
+        </w:rPr>
+      </w:pPr>
+      <w:r>
+        <w:rPr>
+          <w:rFonts w:eastAsia="Calibri"/>
+          <w:sz w:val="22"/>
+          <w:szCs w:val="22"/>
+        </w:rPr>
+        <w:t>1. Firmas Autorizadas</w:t>
+      </w:r>
+      <w:r>
+        <w:rPr>
+          <w:sz w:val="22"/>
+          <w:szCs w:val="22"/>
+        </w:rPr>
+        <w:t>.</w:t>
+      </w:r>
+    </w:p>
+    <w:p>
+      <w:pPr>
+        <w:spacing w:after="0"/>
+        <w:jc w:val="both"/>
+        <w:rPr>
+          <w:rFonts w:eastAsia="Calibri"/>
+          <w:bCs/>
+          <w:color w:val="000000"/>
+          <w:sz w:val="22"/>
+          <w:szCs w:val="22"/>
+        </w:rPr>
+      </w:pPr>
+      <w:r>
+        <w:rPr>
+          <w:rFonts w:eastAsia="Calibri"/>
+          <w:sz w:val="22"/>
+          <w:szCs w:val="22"/>
+        </w:rPr>
+        <w:t xml:space="preserve">2. Sello de </w:t>
+      </w:r>
+      <w:smartTag w:uri="urn:schemas-microsoft-com:office:smarttags" w:element="PersonName">
+        <w:smartTagPr>
+          <w:attr w:name="ProductID" w:val="la Entidad"/>
+        </w:smartTagPr>
+        <w:r>
+          <w:rPr>
+            <w:rFonts w:eastAsia="Calibri"/>
+            <w:sz w:val="22"/>
+            <w:szCs w:val="22"/>
+          </w:rPr>
+          <w:t>la Entidad</w:t>
+        </w:r>
+      </w:smartTag>
+      <w:r>
+        <w:rPr>
+          <w:rFonts w:eastAsia="Calibri"/>
+          <w:sz w:val="22"/>
+          <w:szCs w:val="22"/>
+        </w:rPr>
+        <w:t xml:space="preserve"> Emisora</w:t>
+      </w:r>
+      <w:r>
+        <w:rPr>
+          <w:sz w:val="22"/>
+          <w:szCs w:val="22"/>
+        </w:rPr>
+        <w:t>.</w:t>
+      </w:r>
+    </w:p>
+    <w:sectPr>
+      <w:footerReference w:type="default" r:id="rId10"/>
+      <w:pgSz w:w="11906" w:h="16838" w:code="9"/>
+      <w:pgMar w:top="1440" w:right="1440" w:bottom="1440" w:left="1440" w:header="708" w:footer="708" w:gutter="0"/>
+      <w:cols w:space="708"/>
+      <w:docGrid w:linePitch="360"/>
+    </w:sectPr>
+    <w:tbl>
+      <w:tblPr>
+        <w:tblW w:w="0" w:type="auto"/>
+        <w:tblBorders>
+          <w:top w:val="none" w:sz="0" w:space="0" w:color="auto"/>
+          <w:left w:val="none" w:sz="0" w:space="0" w:color="auto"/>
+          <w:bottom w:val="none" w:sz="0" w:space="0" w:color="auto"/>
+          <w:right w:val="none" w:sz="0" w:space="0" w:color="auto"/>
+          <w:insideH w:val="none" w:sz="0" w:space="0" w:color="auto"/>
+          <w:insideV w:val="none" w:sz="0" w:space="0" w:color="auto"/>
+        </w:tblBorders>
+        <w:jc w:val="center"/>
+      </w:tblPr>
+      <w:tr>
+        <w:tc>
+          <w:tcPr>
+            <w:tcW w:w="4800" w:type="dxa"/>
+            <w:vAlign w:val="bottom"/>
+          </w:tcPr>
+          <w:p>
+            <w:pPr>
+              <w:jc w:val="center"/>
+            </w:pPr>
+            <w:r>
+              <w:t>${img_firma}</w:t>
+            </w:r>
+          </w:p>
+        </w:tc>
+        <w:tc>
+          <w:tcPr>
+            <w:tcW w:w="4800" w:type="dxa"/>
+            <w:vAlign w:val="bottom"/>
+          </w:tcPr>
+          <w:p>
+            <w:pPr>
+              <w:jc w:val="center"/>
+            </w:pPr>
+            <w:r>
+              <w:t>${img_sello}</w:t>
+            </w:r>
+          </w:p>
+        </w:tc>
+      </w:tr>
+    </w:tbl>
+  </w:body>
+</w:document>
 </file>
 
 <file path=word/endnotes.xml><?xml version="1.0" encoding="utf-8"?>

</xml_diff>